<commit_message>
Faltan pruebas del QA
</commit_message>
<xml_diff>
--- a/Sistema de Votaciones.docx
+++ b/Sistema de Votaciones.docx
@@ -3943,6 +3943,14 @@
       </w:r>
       <w:bookmarkEnd w:id="11"/>
     </w:p>
+    <w:p>
+      <w:pPr>
+        <w:pStyle w:val="Ttulo2"/>
+      </w:pPr>
+      <w:r>
+        <w:t>REQUERIMIENTOS FUNCIONALES</w:t>
+      </w:r>
+    </w:p>
     <w:tbl>
       <w:tblPr>
         <w:tblStyle w:val="Tablaconcuadrcula"/>
@@ -4032,7 +4040,7 @@
               <w:jc w:val="center"/>
             </w:pPr>
             <w:r>
-              <w:t>1</w:t>
+              <w:t>RNF-01</w:t>
             </w:r>
           </w:p>
         </w:tc>
@@ -4042,7 +4050,7 @@
           </w:tcPr>
           <w:p>
             <w:r>
-              <w:t>Login</w:t>
+              <w:t>El sistema deberá pedir inicio de sesión mediante correo y contraseña</w:t>
             </w:r>
           </w:p>
         </w:tc>
@@ -4070,7 +4078,7 @@
               <w:jc w:val="center"/>
             </w:pPr>
             <w:r>
-              <w:t>2</w:t>
+              <w:t>RNF-02</w:t>
             </w:r>
           </w:p>
         </w:tc>
@@ -4080,10 +4088,7 @@
           </w:tcPr>
           <w:p>
             <w:r>
-              <w:t>CRUD de usu</w:t>
-            </w:r>
-            <w:r>
-              <w:t>arios</w:t>
+              <w:t>El sistema deberá permitir la gestión de usuarios</w:t>
             </w:r>
           </w:p>
         </w:tc>
@@ -4111,6 +4116,9 @@
               <w:jc w:val="center"/>
             </w:pPr>
             <w:r>
+              <w:t>RNF-0</w:t>
+            </w:r>
+            <w:r>
               <w:t>3</w:t>
             </w:r>
           </w:p>
@@ -4121,10 +4129,7 @@
           </w:tcPr>
           <w:p>
             <w:r>
-              <w:t>C</w:t>
-            </w:r>
-            <w:r>
-              <w:t>rear votaciones</w:t>
+              <w:t xml:space="preserve">El sistema deberá permitir crear procesos electorales </w:t>
             </w:r>
           </w:p>
         </w:tc>
@@ -4152,6 +4157,9 @@
               <w:jc w:val="center"/>
             </w:pPr>
             <w:r>
+              <w:t>RNF-0</w:t>
+            </w:r>
+            <w:r>
               <w:t>4</w:t>
             </w:r>
           </w:p>
@@ -4162,7 +4170,7 @@
           </w:tcPr>
           <w:p>
             <w:r>
-              <w:t>Crear mesas</w:t>
+              <w:t>El sistema deberá permitir registrar partidos políticos</w:t>
             </w:r>
           </w:p>
         </w:tc>
@@ -4190,6 +4198,9 @@
               <w:jc w:val="center"/>
             </w:pPr>
             <w:r>
+              <w:t>RNF-0</w:t>
+            </w:r>
+            <w:r>
               <w:t>5</w:t>
             </w:r>
           </w:p>
@@ -4200,7 +4211,7 @@
           </w:tcPr>
           <w:p>
             <w:r>
-              <w:t>Registrar resultados</w:t>
+              <w:t>El sistema deberá permitir registrar candidatos</w:t>
             </w:r>
           </w:p>
         </w:tc>
@@ -4228,6 +4239,9 @@
               <w:jc w:val="center"/>
             </w:pPr>
             <w:r>
+              <w:t>RNF-0</w:t>
+            </w:r>
+            <w:r>
               <w:t>6</w:t>
             </w:r>
           </w:p>
@@ -4238,7 +4252,7 @@
           </w:tcPr>
           <w:p>
             <w:r>
-              <w:t>Consultar resultados</w:t>
+              <w:t xml:space="preserve">El sistema deberá permitir mesas electorales </w:t>
             </w:r>
           </w:p>
         </w:tc>
@@ -4266,6 +4280,9 @@
               <w:jc w:val="center"/>
             </w:pPr>
             <w:r>
+              <w:t>RNF-0</w:t>
+            </w:r>
+            <w:r>
               <w:t>7</w:t>
             </w:r>
           </w:p>
@@ -4275,16 +4292,8 @@
             <w:tcW w:w="4189" w:type="dxa"/>
           </w:tcPr>
           <w:p>
-            <w:proofErr w:type="spellStart"/>
-            <w:r>
-              <w:t>Dashboard</w:t>
-            </w:r>
-            <w:proofErr w:type="spellEnd"/>
-            <w:r>
-              <w:t xml:space="preserve"> </w:t>
-            </w:r>
-            <w:r>
-              <w:t>para observadores</w:t>
+            <w:r>
+              <w:t xml:space="preserve">El sistema deberá permitir emitir votos </w:t>
             </w:r>
           </w:p>
         </w:tc>
@@ -4297,7 +4306,7 @@
               <w:jc w:val="center"/>
             </w:pPr>
             <w:r>
-              <w:t xml:space="preserve"> Media</w:t>
+              <w:t>Alta</w:t>
             </w:r>
           </w:p>
         </w:tc>
@@ -4312,7 +4321,8 @@
               <w:jc w:val="center"/>
             </w:pPr>
             <w:r>
-              <w:t>8</w:t>
+              <w:lastRenderedPageBreak/>
+              <w:t>RNF-08</w:t>
             </w:r>
           </w:p>
         </w:tc>
@@ -4322,7 +4332,7 @@
           </w:tcPr>
           <w:p>
             <w:r>
-              <w:t>Control de acceso basado en roles</w:t>
+              <w:t>El sistema deberá validar que un usuario no vote más de una vez</w:t>
             </w:r>
           </w:p>
         </w:tc>
@@ -4350,6 +4360,9 @@
               <w:jc w:val="center"/>
             </w:pPr>
             <w:r>
+              <w:t>RNF-0</w:t>
+            </w:r>
+            <w:r>
               <w:t xml:space="preserve">9 </w:t>
             </w:r>
           </w:p>
@@ -4360,7 +4373,7 @@
           </w:tcPr>
           <w:p>
             <w:r>
-              <w:t>Logs de auditoria</w:t>
+              <w:t>El sistema deberá mostrar resultados en tiempo real</w:t>
             </w:r>
           </w:p>
         </w:tc>
@@ -4373,7 +4386,7 @@
               <w:jc w:val="center"/>
             </w:pPr>
             <w:r>
-              <w:t>Alta</w:t>
+              <w:t>Media</w:t>
             </w:r>
           </w:p>
         </w:tc>
@@ -4388,6 +4401,9 @@
               <w:jc w:val="center"/>
             </w:pPr>
             <w:r>
+              <w:t>RNF-</w:t>
+            </w:r>
+            <w:r>
               <w:t>10</w:t>
             </w:r>
           </w:p>
@@ -4398,10 +4414,7 @@
           </w:tcPr>
           <w:p>
             <w:r>
-              <w:t xml:space="preserve">Validación para evitar </w:t>
-            </w:r>
-            <w:r>
-              <w:t>doble voto</w:t>
+              <w:t>El sistema deberá de mostrar las estadísticas en tiempo real.</w:t>
             </w:r>
           </w:p>
         </w:tc>
@@ -4414,7 +4427,7 @@
               <w:jc w:val="center"/>
             </w:pPr>
             <w:r>
-              <w:t>Alta</w:t>
+              <w:t>Media</w:t>
             </w:r>
           </w:p>
         </w:tc>
@@ -4423,6 +4436,289 @@
     <w:p/>
     <w:p>
       <w:pPr>
+        <w:pStyle w:val="Ttulo2"/>
+      </w:pPr>
+      <w:r>
+        <w:t>REQUERIMIENTOS NO FUNCIONALES</w:t>
+      </w:r>
+    </w:p>
+    <w:tbl>
+      <w:tblPr>
+        <w:tblStyle w:val="Tablaconcuadrcula"/>
+        <w:tblW w:w="8841" w:type="dxa"/>
+        <w:tblLook w:val="04A0" w:firstRow="1" w:lastRow="0" w:firstColumn="1" w:lastColumn="0" w:noHBand="0" w:noVBand="1"/>
+      </w:tblPr>
+      <w:tblGrid>
+        <w:gridCol w:w="2547"/>
+        <w:gridCol w:w="6294"/>
+      </w:tblGrid>
+      <w:tr>
+        <w:trPr>
+          <w:trHeight w:val="364"/>
+        </w:trPr>
+        <w:tc>
+          <w:tcPr>
+            <w:tcW w:w="2547" w:type="dxa"/>
+            <w:shd w:val="clear" w:color="auto" w:fill="ADADAD" w:themeFill="background2" w:themeFillShade="BF"/>
+          </w:tcPr>
+          <w:p>
+            <w:pPr>
+              <w:jc w:val="center"/>
+              <w:rPr>
+                <w:b/>
+                <w:bCs/>
+              </w:rPr>
+            </w:pPr>
+            <w:r>
+              <w:rPr>
+                <w:b/>
+                <w:bCs/>
+              </w:rPr>
+              <w:t>ID</w:t>
+            </w:r>
+          </w:p>
+        </w:tc>
+        <w:tc>
+          <w:tcPr>
+            <w:tcW w:w="6294" w:type="dxa"/>
+            <w:shd w:val="clear" w:color="auto" w:fill="ADADAD" w:themeFill="background2" w:themeFillShade="BF"/>
+          </w:tcPr>
+          <w:p>
+            <w:pPr>
+              <w:jc w:val="center"/>
+              <w:rPr>
+                <w:b/>
+                <w:bCs/>
+              </w:rPr>
+            </w:pPr>
+            <w:r>
+              <w:rPr>
+                <w:b/>
+                <w:bCs/>
+              </w:rPr>
+              <w:t>FUNCIONALIDAD</w:t>
+            </w:r>
+          </w:p>
+        </w:tc>
+      </w:tr>
+      <w:tr>
+        <w:trPr>
+          <w:trHeight w:val="751"/>
+        </w:trPr>
+        <w:tc>
+          <w:tcPr>
+            <w:tcW w:w="2547" w:type="dxa"/>
+          </w:tcPr>
+          <w:p>
+            <w:pPr>
+              <w:jc w:val="center"/>
+            </w:pPr>
+            <w:r>
+              <w:t>RNF-01</w:t>
+            </w:r>
+          </w:p>
+        </w:tc>
+        <w:tc>
+          <w:tcPr>
+            <w:tcW w:w="6294" w:type="dxa"/>
+          </w:tcPr>
+          <w:p>
+            <w:r>
+              <w:t>El sistema deberá estar disponible vía web</w:t>
+            </w:r>
+          </w:p>
+        </w:tc>
+      </w:tr>
+      <w:tr>
+        <w:trPr>
+          <w:trHeight w:val="729"/>
+        </w:trPr>
+        <w:tc>
+          <w:tcPr>
+            <w:tcW w:w="2547" w:type="dxa"/>
+          </w:tcPr>
+          <w:p>
+            <w:pPr>
+              <w:jc w:val="center"/>
+            </w:pPr>
+            <w:r>
+              <w:t>RNF-02</w:t>
+            </w:r>
+          </w:p>
+        </w:tc>
+        <w:tc>
+          <w:tcPr>
+            <w:tcW w:w="6294" w:type="dxa"/>
+          </w:tcPr>
+          <w:p>
+            <w:r>
+              <w:t>La interfaz deberá ser intuitiva y fácil de u</w:t>
+            </w:r>
+            <w:r>
+              <w:t>sar</w:t>
+            </w:r>
+          </w:p>
+        </w:tc>
+      </w:tr>
+      <w:tr>
+        <w:trPr>
+          <w:trHeight w:val="729"/>
+        </w:trPr>
+        <w:tc>
+          <w:tcPr>
+            <w:tcW w:w="2547" w:type="dxa"/>
+          </w:tcPr>
+          <w:p>
+            <w:pPr>
+              <w:jc w:val="center"/>
+            </w:pPr>
+            <w:r>
+              <w:t>RNF-0</w:t>
+            </w:r>
+            <w:r>
+              <w:t>3</w:t>
+            </w:r>
+          </w:p>
+        </w:tc>
+        <w:tc>
+          <w:tcPr>
+            <w:tcW w:w="6294" w:type="dxa"/>
+          </w:tcPr>
+          <w:p>
+            <w:r>
+              <w:t>El sistema deberá responder en menos de 3 segundos</w:t>
+            </w:r>
+          </w:p>
+        </w:tc>
+      </w:tr>
+      <w:tr>
+        <w:trPr>
+          <w:trHeight w:val="729"/>
+        </w:trPr>
+        <w:tc>
+          <w:tcPr>
+            <w:tcW w:w="2547" w:type="dxa"/>
+          </w:tcPr>
+          <w:p>
+            <w:pPr>
+              <w:jc w:val="center"/>
+            </w:pPr>
+            <w:r>
+              <w:t>RNF-0</w:t>
+            </w:r>
+            <w:r>
+              <w:t>4</w:t>
+            </w:r>
+          </w:p>
+        </w:tc>
+        <w:tc>
+          <w:tcPr>
+            <w:tcW w:w="6294" w:type="dxa"/>
+          </w:tcPr>
+          <w:p>
+            <w:r>
+              <w:t>Las contraseñas deberán almacenarse cifradas</w:t>
+            </w:r>
+          </w:p>
+        </w:tc>
+      </w:tr>
+      <w:tr>
+        <w:trPr>
+          <w:trHeight w:val="729"/>
+        </w:trPr>
+        <w:tc>
+          <w:tcPr>
+            <w:tcW w:w="2547" w:type="dxa"/>
+          </w:tcPr>
+          <w:p>
+            <w:pPr>
+              <w:jc w:val="center"/>
+            </w:pPr>
+            <w:r>
+              <w:t>RNF-0</w:t>
+            </w:r>
+            <w:r>
+              <w:t>5</w:t>
+            </w:r>
+          </w:p>
+        </w:tc>
+        <w:tc>
+          <w:tcPr>
+            <w:tcW w:w="6294" w:type="dxa"/>
+          </w:tcPr>
+          <w:p>
+            <w:r>
+              <w:t>El sistema deberá mantener sesiones seguras</w:t>
+            </w:r>
+          </w:p>
+        </w:tc>
+      </w:tr>
+      <w:tr>
+        <w:trPr>
+          <w:trHeight w:val="729"/>
+        </w:trPr>
+        <w:tc>
+          <w:tcPr>
+            <w:tcW w:w="2547" w:type="dxa"/>
+          </w:tcPr>
+          <w:p>
+            <w:pPr>
+              <w:jc w:val="center"/>
+            </w:pPr>
+            <w:r>
+              <w:t>RNF-0</w:t>
+            </w:r>
+            <w:r>
+              <w:t>6</w:t>
+            </w:r>
+          </w:p>
+        </w:tc>
+        <w:tc>
+          <w:tcPr>
+            <w:tcW w:w="6294" w:type="dxa"/>
+          </w:tcPr>
+          <w:p>
+            <w:r>
+              <w:t>El sistema deberá ser compatible con navegadores modernos</w:t>
+            </w:r>
+          </w:p>
+        </w:tc>
+      </w:tr>
+      <w:tr>
+        <w:trPr>
+          <w:trHeight w:val="729"/>
+        </w:trPr>
+        <w:tc>
+          <w:tcPr>
+            <w:tcW w:w="2547" w:type="dxa"/>
+          </w:tcPr>
+          <w:p>
+            <w:pPr>
+              <w:jc w:val="center"/>
+            </w:pPr>
+            <w:r>
+              <w:t>RNF-0</w:t>
+            </w:r>
+            <w:r>
+              <w:t>7</w:t>
+            </w:r>
+          </w:p>
+        </w:tc>
+        <w:tc>
+          <w:tcPr>
+            <w:tcW w:w="6294" w:type="dxa"/>
+          </w:tcPr>
+          <w:p>
+            <w:r>
+              <w:t xml:space="preserve">El sistema deberá permitir respaldo de datos </w:t>
+            </w:r>
+          </w:p>
+        </w:tc>
+      </w:tr>
+    </w:tbl>
+    <w:p/>
+    <w:p>
+      <w:pPr>
         <w:pStyle w:val="Ttulo1"/>
       </w:pPr>
       <w:bookmarkStart w:id="12" w:name="_Toc230185485"/>
@@ -4431,129 +4727,650 @@
       </w:r>
       <w:bookmarkEnd w:id="12"/>
     </w:p>
-    <w:p>
-      <w:r>
-        <w:t xml:space="preserve">Como administrador quiero que me permita </w:t>
-      </w:r>
-      <w:r>
-        <w:t>iniciar sesión para acceder al sistema.</w:t>
-      </w:r>
-    </w:p>
-    <w:p>
+    <w:tbl>
+      <w:tblPr>
+        <w:tblStyle w:val="Tablaconcuadrcula"/>
+        <w:tblW w:w="9110" w:type="dxa"/>
+        <w:tblLook w:val="04A0" w:firstRow="1" w:lastRow="0" w:firstColumn="1" w:lastColumn="0" w:noHBand="0" w:noVBand="1"/>
+      </w:tblPr>
+      <w:tblGrid>
+        <w:gridCol w:w="1413"/>
+        <w:gridCol w:w="4252"/>
+        <w:gridCol w:w="3445"/>
+      </w:tblGrid>
+      <w:tr>
+        <w:trPr>
+          <w:trHeight w:val="450"/>
+        </w:trPr>
+        <w:tc>
+          <w:tcPr>
+            <w:tcW w:w="1413" w:type="dxa"/>
+            <w:shd w:val="clear" w:color="auto" w:fill="ADADAD" w:themeFill="background2" w:themeFillShade="BF"/>
+          </w:tcPr>
+          <w:p>
+            <w:pPr>
+              <w:jc w:val="center"/>
+              <w:rPr>
+                <w:b/>
+                <w:bCs/>
+              </w:rPr>
+            </w:pPr>
+            <w:r>
+              <w:rPr>
+                <w:b/>
+                <w:bCs/>
+              </w:rPr>
+              <w:t>ID</w:t>
+            </w:r>
+          </w:p>
+        </w:tc>
+        <w:tc>
+          <w:tcPr>
+            <w:tcW w:w="4252" w:type="dxa"/>
+            <w:shd w:val="clear" w:color="auto" w:fill="ADADAD" w:themeFill="background2" w:themeFillShade="BF"/>
+          </w:tcPr>
+          <w:p>
+            <w:pPr>
+              <w:jc w:val="center"/>
+              <w:rPr>
+                <w:b/>
+                <w:bCs/>
+              </w:rPr>
+            </w:pPr>
+            <w:r>
+              <w:rPr>
+                <w:b/>
+                <w:bCs/>
+              </w:rPr>
+              <w:t>HISTORIA DE USUARIO</w:t>
+            </w:r>
+          </w:p>
+        </w:tc>
+        <w:tc>
+          <w:tcPr>
+            <w:tcW w:w="3445" w:type="dxa"/>
+            <w:shd w:val="clear" w:color="auto" w:fill="ADADAD" w:themeFill="background2" w:themeFillShade="BF"/>
+          </w:tcPr>
+          <w:p>
+            <w:pPr>
+              <w:jc w:val="center"/>
+              <w:rPr>
+                <w:b/>
+                <w:bCs/>
+              </w:rPr>
+            </w:pPr>
+            <w:r>
+              <w:rPr>
+                <w:b/>
+                <w:bCs/>
+              </w:rPr>
+              <w:t>CRITERIOS DE ACEPTACI</w:t>
+            </w:r>
+            <w:r>
+              <w:rPr>
+                <w:b/>
+                <w:bCs/>
+              </w:rPr>
+              <w:t>Ó</w:t>
+            </w:r>
+            <w:r>
+              <w:rPr>
+                <w:b/>
+                <w:bCs/>
+              </w:rPr>
+              <w:t>N</w:t>
+            </w:r>
+          </w:p>
+        </w:tc>
+      </w:tr>
+      <w:tr>
+        <w:trPr>
+          <w:trHeight w:val="318"/>
+        </w:trPr>
+        <w:tc>
+          <w:tcPr>
+            <w:tcW w:w="1413" w:type="dxa"/>
+          </w:tcPr>
+          <w:p>
+            <w:r>
+              <w:t>HU-01</w:t>
+            </w:r>
+          </w:p>
+        </w:tc>
+        <w:tc>
+          <w:tcPr>
+            <w:tcW w:w="4252" w:type="dxa"/>
+          </w:tcPr>
+          <w:p>
+            <w:r>
+              <w:rPr>
+                <w:b/>
+                <w:bCs/>
+              </w:rPr>
+              <w:t xml:space="preserve">Como </w:t>
+            </w:r>
+            <w:r>
+              <w:t>administrador</w:t>
+            </w:r>
+          </w:p>
+          <w:p>
+            <w:r>
+              <w:rPr>
+                <w:b/>
+                <w:bCs/>
+              </w:rPr>
+              <w:t xml:space="preserve">Quiero </w:t>
+            </w:r>
+            <w:r>
+              <w:t>iniciar sesión en el sistema</w:t>
+            </w:r>
+          </w:p>
+          <w:p>
+            <w:r>
+              <w:rPr>
+                <w:b/>
+                <w:bCs/>
+              </w:rPr>
+              <w:t xml:space="preserve">Para </w:t>
+            </w:r>
+            <w:r>
+              <w:t>administrar los procesos electorales de forma segura.</w:t>
+            </w:r>
+          </w:p>
+        </w:tc>
+        <w:tc>
+          <w:tcPr>
+            <w:tcW w:w="3445" w:type="dxa"/>
+          </w:tcPr>
+          <w:p>
+            <w:pPr>
+              <w:pStyle w:val="Prrafodelista"/>
+              <w:numPr>
+                <w:ilvl w:val="0"/>
+                <w:numId w:val="21"/>
+              </w:numPr>
+            </w:pPr>
+            <w:r>
+              <w:t xml:space="preserve">Debe validar usuario y contraseña. </w:t>
+            </w:r>
+          </w:p>
+          <w:p>
+            <w:pPr>
+              <w:pStyle w:val="Prrafodelista"/>
+              <w:numPr>
+                <w:ilvl w:val="0"/>
+                <w:numId w:val="21"/>
+              </w:numPr>
+            </w:pPr>
+            <w:r>
+              <w:t>Debe permitir cerrar sesión</w:t>
+            </w:r>
+          </w:p>
+        </w:tc>
+      </w:tr>
+      <w:tr>
+        <w:trPr>
+          <w:trHeight w:val="318"/>
+        </w:trPr>
+        <w:tc>
+          <w:tcPr>
+            <w:tcW w:w="1413" w:type="dxa"/>
+          </w:tcPr>
+          <w:p>
+            <w:r>
+              <w:t>HU-0</w:t>
+            </w:r>
+            <w:r>
+              <w:t>2</w:t>
+            </w:r>
+          </w:p>
+        </w:tc>
+        <w:tc>
+          <w:tcPr>
+            <w:tcW w:w="4252" w:type="dxa"/>
+          </w:tcPr>
+          <w:p>
+            <w:r>
+              <w:rPr>
+                <w:b/>
+                <w:bCs/>
+              </w:rPr>
+              <w:t xml:space="preserve">Como </w:t>
+            </w:r>
+            <w:r>
+              <w:t xml:space="preserve">administrador </w:t>
+            </w:r>
+          </w:p>
+          <w:p>
+            <w:r>
+              <w:rPr>
+                <w:b/>
+                <w:bCs/>
+              </w:rPr>
+              <w:t>Quiero</w:t>
+            </w:r>
+            <w:r>
+              <w:t xml:space="preserve"> </w:t>
+            </w:r>
+            <w:r>
+              <w:t>registrar candidatos</w:t>
+            </w:r>
+          </w:p>
+          <w:p>
+            <w:r>
+              <w:rPr>
+                <w:b/>
+                <w:bCs/>
+              </w:rPr>
+              <w:t>Para</w:t>
+            </w:r>
+            <w:r>
+              <w:t xml:space="preserve"> habilitarlos </w:t>
+            </w:r>
+          </w:p>
+        </w:tc>
+        <w:tc>
+          <w:tcPr>
+            <w:tcW w:w="3445" w:type="dxa"/>
+          </w:tcPr>
+          <w:p>
+            <w:pPr>
+              <w:pStyle w:val="Prrafodelista"/>
+              <w:numPr>
+                <w:ilvl w:val="0"/>
+                <w:numId w:val="21"/>
+              </w:numPr>
+            </w:pPr>
+            <w:r>
+              <w:t>Debe permitir ingresar nombre</w:t>
+            </w:r>
+          </w:p>
+          <w:p>
+            <w:pPr>
+              <w:pStyle w:val="Prrafodelista"/>
+              <w:numPr>
+                <w:ilvl w:val="0"/>
+                <w:numId w:val="21"/>
+              </w:numPr>
+            </w:pPr>
+            <w:r>
+              <w:t>Debe permitir asignar partido político</w:t>
+            </w:r>
+          </w:p>
+          <w:p>
+            <w:pPr>
+              <w:pStyle w:val="Prrafodelista"/>
+              <w:numPr>
+                <w:ilvl w:val="0"/>
+                <w:numId w:val="21"/>
+              </w:numPr>
+            </w:pPr>
+            <w:r>
+              <w:lastRenderedPageBreak/>
+              <w:t>Debe permitir asignar cargo electoral</w:t>
+            </w:r>
+          </w:p>
+        </w:tc>
+      </w:tr>
+      <w:tr>
+        <w:trPr>
+          <w:trHeight w:val="318"/>
+        </w:trPr>
+        <w:tc>
+          <w:tcPr>
+            <w:tcW w:w="1413" w:type="dxa"/>
+          </w:tcPr>
+          <w:p>
+            <w:r>
+              <w:lastRenderedPageBreak/>
+              <w:t>HU-03</w:t>
+            </w:r>
+          </w:p>
+        </w:tc>
+        <w:tc>
+          <w:tcPr>
+            <w:tcW w:w="4252" w:type="dxa"/>
+          </w:tcPr>
+          <w:p>
+            <w:r>
+              <w:rPr>
+                <w:b/>
+                <w:bCs/>
+              </w:rPr>
+              <w:t xml:space="preserve">Como </w:t>
+            </w:r>
+            <w:r>
+              <w:t>votante</w:t>
+            </w:r>
+          </w:p>
+          <w:p>
+            <w:r>
+              <w:rPr>
+                <w:b/>
+                <w:bCs/>
+              </w:rPr>
+              <w:t xml:space="preserve">Quiero </w:t>
+            </w:r>
+            <w:r>
+              <w:t xml:space="preserve">emitir un voto </w:t>
+            </w:r>
+          </w:p>
+          <w:p>
+            <w:r>
+              <w:rPr>
+                <w:b/>
+                <w:bCs/>
+              </w:rPr>
+              <w:t>Para</w:t>
+            </w:r>
+            <w:r>
+              <w:t xml:space="preserve"> participar en el proceso electoral</w:t>
+            </w:r>
+          </w:p>
+        </w:tc>
+        <w:tc>
+          <w:tcPr>
+            <w:tcW w:w="3445" w:type="dxa"/>
+          </w:tcPr>
+          <w:p>
+            <w:pPr>
+              <w:pStyle w:val="Prrafodelista"/>
+              <w:numPr>
+                <w:ilvl w:val="0"/>
+                <w:numId w:val="21"/>
+              </w:numPr>
+            </w:pPr>
+            <w:r>
+              <w:t>El sistema debe registrar el voto</w:t>
+            </w:r>
+          </w:p>
+          <w:p>
+            <w:pPr>
+              <w:pStyle w:val="Prrafodelista"/>
+              <w:numPr>
+                <w:ilvl w:val="0"/>
+                <w:numId w:val="21"/>
+              </w:numPr>
+            </w:pPr>
+            <w:r>
+              <w:t>Debe impedir doble voto</w:t>
+            </w:r>
+          </w:p>
+          <w:p>
+            <w:pPr>
+              <w:pStyle w:val="Prrafodelista"/>
+              <w:numPr>
+                <w:ilvl w:val="0"/>
+                <w:numId w:val="21"/>
+              </w:numPr>
+            </w:pPr>
+            <w:r>
+              <w:t>Debe confirmar el voto realizado</w:t>
+            </w:r>
+          </w:p>
+        </w:tc>
+      </w:tr>
+    </w:tbl>
+    <w:p/>
+    <w:p>
+      <w:pPr>
+        <w:pStyle w:val="Ttulo1"/>
+      </w:pPr>
+      <w:r>
+        <w:t>ARQUITECTURA DEL SISTEMA</w:t>
+      </w:r>
+    </w:p>
+    <w:p>
+      <w:pPr>
+        <w:pStyle w:val="Ttulo2"/>
+      </w:pPr>
+      <w:r>
+        <w:t>FRONTEND</w:t>
+      </w:r>
+    </w:p>
+    <w:p>
+      <w:pPr>
+        <w:pStyle w:val="Prrafodelista"/>
+        <w:numPr>
+          <w:ilvl w:val="0"/>
+          <w:numId w:val="21"/>
+        </w:numPr>
+      </w:pPr>
+      <w:r>
+        <w:t>HTML 5</w:t>
+      </w:r>
+    </w:p>
+    <w:p>
+      <w:pPr>
+        <w:pStyle w:val="Prrafodelista"/>
+        <w:numPr>
+          <w:ilvl w:val="0"/>
+          <w:numId w:val="21"/>
+        </w:numPr>
+      </w:pPr>
+      <w:r>
+        <w:t>CSS</w:t>
+      </w:r>
+    </w:p>
+    <w:p>
+      <w:pPr>
+        <w:pStyle w:val="Ttulo2"/>
+      </w:pPr>
+      <w:r>
+        <w:t>BACKEND</w:t>
+      </w:r>
+    </w:p>
+    <w:p>
+      <w:pPr>
+        <w:pStyle w:val="Prrafodelista"/>
+        <w:numPr>
+          <w:ilvl w:val="0"/>
+          <w:numId w:val="21"/>
+        </w:numPr>
+      </w:pPr>
+      <w:r>
+        <w:t>PHP</w:t>
+      </w:r>
+    </w:p>
+    <w:p>
+      <w:pPr>
+        <w:pStyle w:val="Ttulo2"/>
+      </w:pPr>
+      <w:r>
+        <w:t>BASE DE DATOS</w:t>
+      </w:r>
+    </w:p>
+    <w:p>
+      <w:pPr>
+        <w:pStyle w:val="Prrafodelista"/>
+        <w:numPr>
+          <w:ilvl w:val="0"/>
+          <w:numId w:val="21"/>
+        </w:numPr>
+      </w:pPr>
+      <w:r>
+        <w:t>MySQL</w:t>
+      </w:r>
+    </w:p>
+    <w:p>
+      <w:pPr>
+        <w:pStyle w:val="Ttulo2"/>
+      </w:pPr>
+      <w:r>
+        <w:t>SERVIDOR LOCAL</w:t>
+      </w:r>
+    </w:p>
+    <w:p>
+      <w:pPr>
+        <w:pStyle w:val="Prrafodelista"/>
+        <w:numPr>
+          <w:ilvl w:val="0"/>
+          <w:numId w:val="21"/>
+        </w:numPr>
+      </w:pPr>
+      <w:r>
+        <w:t>XAM</w:t>
+      </w:r>
+      <w:r>
+        <w:t>PP</w:t>
+      </w:r>
+    </w:p>
+    <w:p>
+      <w:pPr>
+        <w:pStyle w:val="Ttulo2"/>
+      </w:pPr>
+      <w:r>
+        <w:t>CONTROL DE VERSIONES</w:t>
+      </w:r>
+    </w:p>
+    <w:p>
+      <w:pPr>
+        <w:pStyle w:val="Prrafodelista"/>
+        <w:numPr>
+          <w:ilvl w:val="0"/>
+          <w:numId w:val="21"/>
+        </w:numPr>
+      </w:pPr>
+      <w:r>
+        <w:t>GitHub</w:t>
+      </w:r>
+    </w:p>
+    <w:p>
+      <w:pPr>
+        <w:pStyle w:val="Ttulo1"/>
+      </w:pPr>
+      <w:r>
+        <w:t xml:space="preserve">ROLES DEL SISTEMA </w:t>
+      </w:r>
+    </w:p>
+    <w:p>
+      <w:pPr>
+        <w:pStyle w:val="Ttulo2"/>
+      </w:pPr>
+      <w:r>
+        <w:t>ADMINISTRADOR</w:t>
+      </w:r>
+    </w:p>
+    <w:p>
+      <w:pPr>
+        <w:pStyle w:val="Prrafodelista"/>
+        <w:numPr>
+          <w:ilvl w:val="0"/>
+          <w:numId w:val="20"/>
+        </w:numPr>
+      </w:pPr>
+      <w:r>
+        <w:t>Gestiona usuarios</w:t>
+      </w:r>
+    </w:p>
+    <w:p>
+      <w:pPr>
+        <w:pStyle w:val="Prrafodelista"/>
+        <w:numPr>
+          <w:ilvl w:val="0"/>
+          <w:numId w:val="20"/>
+        </w:numPr>
+      </w:pPr>
+      <w:r>
+        <w:t>Administra mesas</w:t>
+      </w:r>
+    </w:p>
+    <w:p>
+      <w:pPr>
+        <w:pStyle w:val="Prrafodelista"/>
+        <w:numPr>
+          <w:ilvl w:val="0"/>
+          <w:numId w:val="20"/>
+        </w:numPr>
+      </w:pPr>
+      <w:r>
+        <w:t>Consulta resultados</w:t>
+      </w:r>
+    </w:p>
+    <w:p>
+      <w:pPr>
+        <w:pStyle w:val="Prrafodelista"/>
+        <w:numPr>
+          <w:ilvl w:val="0"/>
+          <w:numId w:val="20"/>
+        </w:numPr>
+      </w:pPr>
+      <w:r>
+        <w:t>Gestiona candidatos</w:t>
+      </w:r>
+    </w:p>
+    <w:p>
+      <w:pPr>
+        <w:pStyle w:val="Prrafodelista"/>
+        <w:numPr>
+          <w:ilvl w:val="0"/>
+          <w:numId w:val="20"/>
+        </w:numPr>
+      </w:pPr>
+      <w:r>
+        <w:t>Gestiona partidos</w:t>
+      </w:r>
+    </w:p>
+    <w:p>
+      <w:pPr>
+        <w:pStyle w:val="Ttulo2"/>
+      </w:pPr>
       <w:r>
         <w:lastRenderedPageBreak/>
-        <w:t xml:space="preserve">Como administrador quiero crear usuarios para </w:t>
-      </w:r>
-      <w:r>
-        <w:t>controlar el acceso al sistema.</w:t>
-      </w:r>
-    </w:p>
-    <w:p>
-      <w:r>
-        <w:t>Como administrador quiero crear votaciones para administrar procesos electorales.</w:t>
-      </w:r>
-    </w:p>
-    <w:p>
-      <w:r>
-        <w:t xml:space="preserve">Como administrador quiero </w:t>
-      </w:r>
-      <w:r>
-        <w:t>registrar mesas electorales para organizar la votación.</w:t>
-      </w:r>
-    </w:p>
-    <w:p>
-      <w:r>
-        <w:t>Como digitador quiero registrar resultados para almacenar votos correctamente.</w:t>
-      </w:r>
-    </w:p>
-    <w:p>
-      <w:r>
-        <w:t>Como administrador quiero consultar resultados para visualizar información electoral.</w:t>
-      </w:r>
-    </w:p>
+        <w:t>VOTANTE</w:t>
+      </w:r>
+    </w:p>
+    <w:p>
+      <w:pPr>
+        <w:pStyle w:val="Prrafodelista"/>
+        <w:numPr>
+          <w:ilvl w:val="0"/>
+          <w:numId w:val="20"/>
+        </w:numPr>
+      </w:pPr>
+      <w:r>
+        <w:t xml:space="preserve">Emite su voto </w:t>
+      </w:r>
+    </w:p>
+    <w:p>
+      <w:pPr>
+        <w:pStyle w:val="Prrafodelista"/>
+        <w:numPr>
+          <w:ilvl w:val="0"/>
+          <w:numId w:val="20"/>
+        </w:numPr>
+      </w:pPr>
+      <w:r>
+        <w:t>Visualiza estadísticas</w:t>
+      </w:r>
+    </w:p>
+    <w:p/>
+    <w:p/>
     <w:p>
       <w:pPr>
         <w:pStyle w:val="Ttulo1"/>
       </w:pPr>
-      <w:bookmarkStart w:id="13" w:name="_Toc230185486"/>
-      <w:r>
-        <w:t>CRITERIOS DE ACEPTACI</w:t>
-      </w:r>
-      <w:r>
-        <w:t>Ó</w:t>
-      </w:r>
-      <w:r>
-        <w:t>N</w:t>
+      <w:bookmarkStart w:id="13" w:name="_Toc230185487"/>
+      <w:r>
+        <w:t>SPRINT</w:t>
+      </w:r>
+      <w:r>
+        <w:t xml:space="preserve"> BACKLOG</w:t>
       </w:r>
       <w:bookmarkEnd w:id="13"/>
     </w:p>
     <w:p>
-      <w:r>
-        <w:t>El sistema debe permitir ingresar si el usuario y contraseña son válidos.</w:t>
-      </w:r>
-    </w:p>
-    <w:p>
-      <w:r>
-        <w:t>El sistema debe permitir registrar usuarios nuevos con sus datos correspondientes.</w:t>
-      </w:r>
-    </w:p>
-    <w:p>
-      <w:r>
-        <w:t>El sistema debe permitir crear votaciones con nombre y fecha.</w:t>
-      </w:r>
-    </w:p>
-    <w:p>
-      <w:r>
-        <w:t>EL sistema debe p</w:t>
-      </w:r>
-      <w:r>
-        <w:t>ermitir crear votaciones con nombre y fecha.</w:t>
-      </w:r>
-    </w:p>
-    <w:p>
-      <w:r>
-        <w:t>El sistema debe permitir registrar mesas electorales con número y ubicación.</w:t>
-      </w:r>
-    </w:p>
-    <w:p>
-      <w:r>
-        <w:t>El sistema debe guardar correctamente los resultados ingresados.</w:t>
-      </w:r>
-    </w:p>
-    <w:p>
-      <w:r>
-        <w:t>El sistema debe mostrar resultados almacenados de manera ordena</w:t>
-      </w:r>
-      <w:r>
-        <w:t>da.</w:t>
-      </w:r>
-    </w:p>
-    <w:p/>
-    <w:p>
-      <w:pPr>
-        <w:pStyle w:val="Ttulo1"/>
-      </w:pPr>
-      <w:bookmarkStart w:id="14" w:name="_Toc230185487"/>
-      <w:r>
-        <w:t>SPRINT</w:t>
-      </w:r>
-      <w:r>
-        <w:t xml:space="preserve"> BACKLOG</w:t>
+      <w:pPr>
+        <w:pStyle w:val="Ttulo2"/>
+      </w:pPr>
+      <w:bookmarkStart w:id="14" w:name="_Toc230185488"/>
+      <w:r>
+        <w:t>SPRINT 1</w:t>
+      </w:r>
+      <w:r>
+        <w:t xml:space="preserve"> – PLANIFICACIÓN Y ANÁLISIS</w:t>
       </w:r>
       <w:bookmarkEnd w:id="14"/>
-    </w:p>
-    <w:p>
-      <w:pPr>
-        <w:pStyle w:val="Ttulo2"/>
-      </w:pPr>
-      <w:bookmarkStart w:id="15" w:name="_Toc230185488"/>
-      <w:r>
-        <w:t>SPRINT 1</w:t>
-      </w:r>
-      <w:r>
-        <w:t xml:space="preserve"> – PLANIFICACIÓN Y ANÁLISIS</w:t>
-      </w:r>
-      <w:bookmarkEnd w:id="15"/>
     </w:p>
     <w:p>
       <w:r>
@@ -4690,7 +5507,6 @@
                 <w:b/>
                 <w:bCs/>
               </w:rPr>
-              <w:lastRenderedPageBreak/>
               <w:t>TAREA</w:t>
             </w:r>
           </w:p>
@@ -5000,8 +5816,9 @@
       <w:pPr>
         <w:pStyle w:val="Ttulo2"/>
       </w:pPr>
-      <w:bookmarkStart w:id="16" w:name="_Toc230185489"/>
-      <w:r>
+      <w:bookmarkStart w:id="15" w:name="_Toc230185489"/>
+      <w:r>
+        <w:lastRenderedPageBreak/>
         <w:t xml:space="preserve">SPRINT </w:t>
       </w:r>
       <w:r>
@@ -5013,7 +5830,7 @@
       <w:r>
         <w:t>DESARROLLO BASE DEL SISTEMA</w:t>
       </w:r>
-      <w:bookmarkEnd w:id="16"/>
+      <w:bookmarkEnd w:id="15"/>
     </w:p>
     <w:p>
       <w:r>
@@ -5326,7 +6143,6 @@
           </w:tcPr>
           <w:p>
             <w:r>
-              <w:lastRenderedPageBreak/>
               <w:t>Implementación de control de acceso por roles</w:t>
             </w:r>
           </w:p>
@@ -5474,11 +6290,11 @@
       <w:pPr>
         <w:pStyle w:val="Ttulo2"/>
       </w:pPr>
-      <w:bookmarkStart w:id="17" w:name="_Toc230185490"/>
+      <w:bookmarkStart w:id="16" w:name="_Toc230185490"/>
       <w:r>
         <w:t>SPRINT 3 – DESARROLLO DE MÓDULOS PRINCIPALES</w:t>
       </w:r>
-      <w:bookmarkEnd w:id="17"/>
+      <w:bookmarkEnd w:id="16"/>
     </w:p>
     <w:p>
       <w:r>
@@ -5528,6 +6344,7 @@
         </w:numPr>
       </w:pPr>
       <w:r>
+        <w:lastRenderedPageBreak/>
         <w:t>Registro de resultados.</w:t>
       </w:r>
     </w:p>
@@ -5933,11 +6750,14 @@
       <w:pPr>
         <w:pStyle w:val="Ttulo2"/>
       </w:pPr>
-      <w:bookmarkStart w:id="18" w:name="_Toc230185491"/>
-      <w:r>
-        <w:t>SPRINT 4 – QA, pruebas y entrega final</w:t>
-      </w:r>
-      <w:bookmarkEnd w:id="18"/>
+      <w:bookmarkStart w:id="17" w:name="_Toc230185491"/>
+      <w:r>
+        <w:t xml:space="preserve">SPRINT 4 – QA, </w:t>
+      </w:r>
+      <w:bookmarkEnd w:id="17"/>
+      <w:r>
+        <w:t>PRUEBAS Y ENTREGA FINAL</w:t>
+      </w:r>
     </w:p>
     <w:p>
       <w:r>
@@ -6125,6 +6945,7 @@
           </w:tcPr>
           <w:p>
             <w:r>
+              <w:lastRenderedPageBreak/>
               <w:t>Realización de pruebas funcionales</w:t>
             </w:r>
           </w:p>
@@ -6388,42 +7209,131 @@
       <w:pPr>
         <w:pStyle w:val="Ttulo1"/>
       </w:pPr>
-      <w:bookmarkStart w:id="19" w:name="_Toc230185492"/>
-      <w:r>
-        <w:t>METODOLOGÍA SCRUM</w:t>
-      </w:r>
-      <w:bookmarkEnd w:id="19"/>
-    </w:p>
-    <w:p>
-      <w:r>
-        <w:t xml:space="preserve">Para el desarrollo del proyecto se utilizó la metodología ágil Scrum, permitiendo organizar las actividades mediante diferentes </w:t>
-      </w:r>
+      <w:bookmarkStart w:id="18" w:name="_Toc230185492"/>
+      <w:r>
+        <w:t>M</w:t>
+      </w:r>
+      <w:bookmarkEnd w:id="18"/>
+      <w:r>
+        <w:t>ODULOS DEL SISTEMA</w:t>
+      </w:r>
+    </w:p>
+    <w:p>
+      <w:pPr>
+        <w:pStyle w:val="Prrafodelista"/>
+        <w:numPr>
+          <w:ilvl w:val="0"/>
+          <w:numId w:val="1"/>
+        </w:numPr>
+      </w:pPr>
       <w:proofErr w:type="spellStart"/>
       <w:r>
-        <w:t>Sprints</w:t>
+        <w:t>Modulo</w:t>
       </w:r>
       <w:proofErr w:type="spellEnd"/>
       <w:r>
-        <w:t xml:space="preserve"> de trabajo.</w:t>
-      </w:r>
-    </w:p>
-    <w:p>
-      <w:r>
-        <w:lastRenderedPageBreak/>
-        <w:t xml:space="preserve">La metodología Scrum permitió dividir el proyecto en etapas pequeñas, facilitando la planificación, el control de tareas y el </w:t>
-      </w:r>
-      <w:r>
-        <w:t>seguimiento del desarrollo del sistema.</w:t>
-      </w:r>
-    </w:p>
-    <w:p>
-      <w:r>
-        <w:t>Se utilizaron herramientas como Trello para la administración de tareas y GitHub para el control de versiones del proyecto.</w:t>
-      </w:r>
-    </w:p>
-    <w:p/>
-    <w:p/>
-    <w:p/>
+        <w:t xml:space="preserve"> de autenticación </w:t>
+      </w:r>
+    </w:p>
+    <w:p>
+      <w:pPr>
+        <w:pStyle w:val="Prrafodelista"/>
+        <w:numPr>
+          <w:ilvl w:val="0"/>
+          <w:numId w:val="1"/>
+        </w:numPr>
+      </w:pPr>
+      <w:proofErr w:type="spellStart"/>
+      <w:r>
+        <w:t>Modulo</w:t>
+      </w:r>
+      <w:proofErr w:type="spellEnd"/>
+      <w:r>
+        <w:t xml:space="preserve"> de usuarios </w:t>
+      </w:r>
+    </w:p>
+    <w:p>
+      <w:pPr>
+        <w:pStyle w:val="Prrafodelista"/>
+        <w:numPr>
+          <w:ilvl w:val="0"/>
+          <w:numId w:val="1"/>
+        </w:numPr>
+      </w:pPr>
+      <w:proofErr w:type="spellStart"/>
+      <w:r>
+        <w:t>Modulo</w:t>
+      </w:r>
+      <w:proofErr w:type="spellEnd"/>
+      <w:r>
+        <w:t xml:space="preserve"> de partidos políticos </w:t>
+      </w:r>
+    </w:p>
+    <w:p>
+      <w:pPr>
+        <w:pStyle w:val="Prrafodelista"/>
+        <w:numPr>
+          <w:ilvl w:val="0"/>
+          <w:numId w:val="1"/>
+        </w:numPr>
+      </w:pPr>
+      <w:r>
+        <w:t xml:space="preserve">Modulo de candidatos </w:t>
+      </w:r>
+    </w:p>
+    <w:p>
+      <w:pPr>
+        <w:pStyle w:val="Prrafodelista"/>
+        <w:numPr>
+          <w:ilvl w:val="0"/>
+          <w:numId w:val="1"/>
+        </w:numPr>
+      </w:pPr>
+      <w:r>
+        <w:t>Modulo votaciones</w:t>
+      </w:r>
+    </w:p>
+    <w:p>
+      <w:pPr>
+        <w:pStyle w:val="Prrafodelista"/>
+        <w:numPr>
+          <w:ilvl w:val="0"/>
+          <w:numId w:val="1"/>
+        </w:numPr>
+      </w:pPr>
+      <w:r>
+        <w:t xml:space="preserve">Modulo mesas electorales </w:t>
+      </w:r>
+    </w:p>
+    <w:p>
+      <w:pPr>
+        <w:pStyle w:val="Prrafodelista"/>
+        <w:numPr>
+          <w:ilvl w:val="0"/>
+          <w:numId w:val="1"/>
+        </w:numPr>
+      </w:pPr>
+      <w:r>
+        <w:t>Modulo resultados</w:t>
+      </w:r>
+    </w:p>
+    <w:p>
+      <w:pPr>
+        <w:pStyle w:val="Prrafodelista"/>
+        <w:numPr>
+          <w:ilvl w:val="0"/>
+          <w:numId w:val="1"/>
+        </w:numPr>
+      </w:pPr>
+      <w:r>
+        <w:t xml:space="preserve">Modulo reportes </w:t>
+      </w:r>
+    </w:p>
+    <w:p>
+      <w:pPr>
+        <w:ind w:left="360"/>
+      </w:pPr>
+    </w:p>
     <w:sectPr>
       <w:pgSz w:w="12240" w:h="15840"/>
       <w:pgMar w:top="1417" w:right="1701" w:bottom="1417" w:left="1701" w:header="708" w:footer="708" w:gutter="0"/>
@@ -6437,6 +7347,1906 @@
 <file path=word/numbering.xml><?xml version="1.0" encoding="utf-8"?>
 <w:numbering xmlns:wpc="http://schemas.microsoft.com/office/word/2010/wordprocessingCanvas" xmlns:cx="http://schemas.microsoft.com/office/drawing/2014/chartex" xmlns:cx1="http://schemas.microsoft.com/office/drawing/2015/9/8/chartex" xmlns:cx2="http://schemas.microsoft.com/office/drawing/2015/10/21/chartex" xmlns:cx3="http://schemas.microsoft.com/office/drawing/2016/5/9/chartex" xmlns:cx4="http://schemas.microsoft.com/office/drawing/2016/5/10/chartex" xmlns:cx5="http://schemas.microsoft.com/office/drawing/2016/5/11/chartex" xmlns:cx6="http://schemas.microsoft.com/office/drawing/2016/5/12/chartex" xmlns:cx7="http://schemas.microsoft.com/office/drawing/2016/5/13/chartex" xmlns:cx8="http://schemas.microsoft.com/office/drawing/2016/5/14/chartex" xmlns:mc="http://schemas.openxmlformats.org/markup-compatibility/2006" xmlns:aink="http://schemas.microsoft.com/office/drawing/2016/ink" xmlns:am3d="http://schemas.microsoft.com/office/drawing/2017/model3d" xmlns:o="urn:schemas-microsoft-com:office:office" xmlns:oel="http://schemas.microsoft.com/office/2019/extlst" xmlns:r="http://schemas.openxmlformats.org/officeDocument/2006/relationships" xmlns:m="http://schemas.openxmlformats.org/officeDocument/2006/math" xmlns:v="urn:schemas-microsoft-com:vml" xmlns:wp14="http://schemas.microsoft.com/office/word/2010/wordprocessingDrawing" xmlns:wp="http://schemas.openxmlformats.org/drawingml/2006/wordprocessingDrawing" xmlns:w10="urn:schemas-microsoft-com:office:word" xmlns:w="http://schemas.openxmlformats.org/wordprocessingml/2006/main" xmlns:w14="http://schemas.microsoft.com/office/word/2010/wordml" xmlns:w15="http://schemas.microsoft.com/office/word/2012/wordml" xmlns:w16cex="http://schemas.microsoft.com/office/word/2018/wordml/cex" xmlns:w16cid="http://schemas.microsoft.com/office/word/2016/wordml/cid" xmlns:w16="http://schemas.microsoft.com/office/word/2018/wordml" xmlns:w16du="http://schemas.microsoft.com/office/word/2023/wordml/word16du" xmlns:w16sdtdh="http://schemas.microsoft.com/office/word/2020/wordml/sdtdatahash" xmlns:w16sdtfl="http://schemas.microsoft.com/office/word/2024/wordml/sdtformatlock" xmlns:w16se="http://schemas.microsoft.com/office/word/2015/wordml/symex" xmlns:wpg="http://schemas.microsoft.com/office/word/2010/wordprocessingGroup" xmlns:wpi="http://schemas.microsoft.com/office/word/2010/wordprocessingInk" xmlns:wne="http://schemas.microsoft.com/office/word/2006/wordml" xmlns:wps="http://schemas.microsoft.com/office/word/2010/wordprocessingShape" mc:Ignorable="w14 w15 w16se w16cid w16 w16cex w16sdtdh w16sdtfl w16du wp14">
   <w:abstractNum w:abstractNumId="0" w15:restartNumberingAfterBreak="0">
+    <w:nsid w:val="000201D6"/>
+    <w:multiLevelType w:val="multilevel"/>
+    <w:tmpl w:val="1D8CE228"/>
+    <w:lvl w:ilvl="0">
+      <w:start w:val="1"/>
+      <w:numFmt w:val="bullet"/>
+      <w:lvlText w:val=""/>
+      <w:lvlJc w:val="left"/>
+      <w:pPr>
+        <w:tabs>
+          <w:tab w:val="num" w:pos="720"/>
+        </w:tabs>
+        <w:ind w:left="720" w:hanging="360"/>
+      </w:pPr>
+      <w:rPr>
+        <w:rFonts w:ascii="Symbol" w:hAnsi="Symbol" w:hint="default"/>
+        <w:sz w:val="20"/>
+      </w:rPr>
+    </w:lvl>
+    <w:lvl w:ilvl="1" w:tentative="1">
+      <w:start w:val="1"/>
+      <w:numFmt w:val="bullet"/>
+      <w:lvlText w:val="o"/>
+      <w:lvlJc w:val="left"/>
+      <w:pPr>
+        <w:tabs>
+          <w:tab w:val="num" w:pos="1440"/>
+        </w:tabs>
+        <w:ind w:left="1440" w:hanging="360"/>
+      </w:pPr>
+      <w:rPr>
+        <w:rFonts w:ascii="Courier New" w:hAnsi="Courier New" w:hint="default"/>
+        <w:sz w:val="20"/>
+      </w:rPr>
+    </w:lvl>
+    <w:lvl w:ilvl="2" w:tentative="1">
+      <w:start w:val="1"/>
+      <w:numFmt w:val="bullet"/>
+      <w:lvlText w:val=""/>
+      <w:lvlJc w:val="left"/>
+      <w:pPr>
+        <w:tabs>
+          <w:tab w:val="num" w:pos="2160"/>
+        </w:tabs>
+        <w:ind w:left="2160" w:hanging="360"/>
+      </w:pPr>
+      <w:rPr>
+        <w:rFonts w:ascii="Wingdings" w:hAnsi="Wingdings" w:hint="default"/>
+        <w:sz w:val="20"/>
+      </w:rPr>
+    </w:lvl>
+    <w:lvl w:ilvl="3" w:tentative="1">
+      <w:start w:val="1"/>
+      <w:numFmt w:val="bullet"/>
+      <w:lvlText w:val=""/>
+      <w:lvlJc w:val="left"/>
+      <w:pPr>
+        <w:tabs>
+          <w:tab w:val="num" w:pos="2880"/>
+        </w:tabs>
+        <w:ind w:left="2880" w:hanging="360"/>
+      </w:pPr>
+      <w:rPr>
+        <w:rFonts w:ascii="Wingdings" w:hAnsi="Wingdings" w:hint="default"/>
+        <w:sz w:val="20"/>
+      </w:rPr>
+    </w:lvl>
+    <w:lvl w:ilvl="4" w:tentative="1">
+      <w:start w:val="1"/>
+      <w:numFmt w:val="bullet"/>
+      <w:lvlText w:val=""/>
+      <w:lvlJc w:val="left"/>
+      <w:pPr>
+        <w:tabs>
+          <w:tab w:val="num" w:pos="3600"/>
+        </w:tabs>
+        <w:ind w:left="3600" w:hanging="360"/>
+      </w:pPr>
+      <w:rPr>
+        <w:rFonts w:ascii="Wingdings" w:hAnsi="Wingdings" w:hint="default"/>
+        <w:sz w:val="20"/>
+      </w:rPr>
+    </w:lvl>
+    <w:lvl w:ilvl="5" w:tentative="1">
+      <w:start w:val="1"/>
+      <w:numFmt w:val="bullet"/>
+      <w:lvlText w:val=""/>
+      <w:lvlJc w:val="left"/>
+      <w:pPr>
+        <w:tabs>
+          <w:tab w:val="num" w:pos="4320"/>
+        </w:tabs>
+        <w:ind w:left="4320" w:hanging="360"/>
+      </w:pPr>
+      <w:rPr>
+        <w:rFonts w:ascii="Wingdings" w:hAnsi="Wingdings" w:hint="default"/>
+        <w:sz w:val="20"/>
+      </w:rPr>
+    </w:lvl>
+    <w:lvl w:ilvl="6" w:tentative="1">
+      <w:start w:val="1"/>
+      <w:numFmt w:val="bullet"/>
+      <w:lvlText w:val=""/>
+      <w:lvlJc w:val="left"/>
+      <w:pPr>
+        <w:tabs>
+          <w:tab w:val="num" w:pos="5040"/>
+        </w:tabs>
+        <w:ind w:left="5040" w:hanging="360"/>
+      </w:pPr>
+      <w:rPr>
+        <w:rFonts w:ascii="Wingdings" w:hAnsi="Wingdings" w:hint="default"/>
+        <w:sz w:val="20"/>
+      </w:rPr>
+    </w:lvl>
+    <w:lvl w:ilvl="7" w:tentative="1">
+      <w:start w:val="1"/>
+      <w:numFmt w:val="bullet"/>
+      <w:lvlText w:val=""/>
+      <w:lvlJc w:val="left"/>
+      <w:pPr>
+        <w:tabs>
+          <w:tab w:val="num" w:pos="5760"/>
+        </w:tabs>
+        <w:ind w:left="5760" w:hanging="360"/>
+      </w:pPr>
+      <w:rPr>
+        <w:rFonts w:ascii="Wingdings" w:hAnsi="Wingdings" w:hint="default"/>
+        <w:sz w:val="20"/>
+      </w:rPr>
+    </w:lvl>
+    <w:lvl w:ilvl="8" w:tentative="1">
+      <w:start w:val="1"/>
+      <w:numFmt w:val="bullet"/>
+      <w:lvlText w:val=""/>
+      <w:lvlJc w:val="left"/>
+      <w:pPr>
+        <w:tabs>
+          <w:tab w:val="num" w:pos="6480"/>
+        </w:tabs>
+        <w:ind w:left="6480" w:hanging="360"/>
+      </w:pPr>
+      <w:rPr>
+        <w:rFonts w:ascii="Wingdings" w:hAnsi="Wingdings" w:hint="default"/>
+        <w:sz w:val="20"/>
+      </w:rPr>
+    </w:lvl>
+  </w:abstractNum>
+  <w:abstractNum w:abstractNumId="1" w15:restartNumberingAfterBreak="0">
+    <w:nsid w:val="03337D6D"/>
+    <w:multiLevelType w:val="multilevel"/>
+    <w:tmpl w:val="3A32FA6A"/>
+    <w:lvl w:ilvl="0">
+      <w:start w:val="1"/>
+      <w:numFmt w:val="bullet"/>
+      <w:lvlText w:val=""/>
+      <w:lvlJc w:val="left"/>
+      <w:pPr>
+        <w:tabs>
+          <w:tab w:val="num" w:pos="720"/>
+        </w:tabs>
+        <w:ind w:left="720" w:hanging="360"/>
+      </w:pPr>
+      <w:rPr>
+        <w:rFonts w:ascii="Symbol" w:hAnsi="Symbol" w:hint="default"/>
+        <w:sz w:val="20"/>
+      </w:rPr>
+    </w:lvl>
+    <w:lvl w:ilvl="1" w:tentative="1">
+      <w:start w:val="1"/>
+      <w:numFmt w:val="bullet"/>
+      <w:lvlText w:val="o"/>
+      <w:lvlJc w:val="left"/>
+      <w:pPr>
+        <w:tabs>
+          <w:tab w:val="num" w:pos="1440"/>
+        </w:tabs>
+        <w:ind w:left="1440" w:hanging="360"/>
+      </w:pPr>
+      <w:rPr>
+        <w:rFonts w:ascii="Courier New" w:hAnsi="Courier New" w:hint="default"/>
+        <w:sz w:val="20"/>
+      </w:rPr>
+    </w:lvl>
+    <w:lvl w:ilvl="2" w:tentative="1">
+      <w:start w:val="1"/>
+      <w:numFmt w:val="bullet"/>
+      <w:lvlText w:val=""/>
+      <w:lvlJc w:val="left"/>
+      <w:pPr>
+        <w:tabs>
+          <w:tab w:val="num" w:pos="2160"/>
+        </w:tabs>
+        <w:ind w:left="2160" w:hanging="360"/>
+      </w:pPr>
+      <w:rPr>
+        <w:rFonts w:ascii="Wingdings" w:hAnsi="Wingdings" w:hint="default"/>
+        <w:sz w:val="20"/>
+      </w:rPr>
+    </w:lvl>
+    <w:lvl w:ilvl="3" w:tentative="1">
+      <w:start w:val="1"/>
+      <w:numFmt w:val="bullet"/>
+      <w:lvlText w:val=""/>
+      <w:lvlJc w:val="left"/>
+      <w:pPr>
+        <w:tabs>
+          <w:tab w:val="num" w:pos="2880"/>
+        </w:tabs>
+        <w:ind w:left="2880" w:hanging="360"/>
+      </w:pPr>
+      <w:rPr>
+        <w:rFonts w:ascii="Wingdings" w:hAnsi="Wingdings" w:hint="default"/>
+        <w:sz w:val="20"/>
+      </w:rPr>
+    </w:lvl>
+    <w:lvl w:ilvl="4" w:tentative="1">
+      <w:start w:val="1"/>
+      <w:numFmt w:val="bullet"/>
+      <w:lvlText w:val=""/>
+      <w:lvlJc w:val="left"/>
+      <w:pPr>
+        <w:tabs>
+          <w:tab w:val="num" w:pos="3600"/>
+        </w:tabs>
+        <w:ind w:left="3600" w:hanging="360"/>
+      </w:pPr>
+      <w:rPr>
+        <w:rFonts w:ascii="Wingdings" w:hAnsi="Wingdings" w:hint="default"/>
+        <w:sz w:val="20"/>
+      </w:rPr>
+    </w:lvl>
+    <w:lvl w:ilvl="5" w:tentative="1">
+      <w:start w:val="1"/>
+      <w:numFmt w:val="bullet"/>
+      <w:lvlText w:val=""/>
+      <w:lvlJc w:val="left"/>
+      <w:pPr>
+        <w:tabs>
+          <w:tab w:val="num" w:pos="4320"/>
+        </w:tabs>
+        <w:ind w:left="4320" w:hanging="360"/>
+      </w:pPr>
+      <w:rPr>
+        <w:rFonts w:ascii="Wingdings" w:hAnsi="Wingdings" w:hint="default"/>
+        <w:sz w:val="20"/>
+      </w:rPr>
+    </w:lvl>
+    <w:lvl w:ilvl="6" w:tentative="1">
+      <w:start w:val="1"/>
+      <w:numFmt w:val="bullet"/>
+      <w:lvlText w:val=""/>
+      <w:lvlJc w:val="left"/>
+      <w:pPr>
+        <w:tabs>
+          <w:tab w:val="num" w:pos="5040"/>
+        </w:tabs>
+        <w:ind w:left="5040" w:hanging="360"/>
+      </w:pPr>
+      <w:rPr>
+        <w:rFonts w:ascii="Wingdings" w:hAnsi="Wingdings" w:hint="default"/>
+        <w:sz w:val="20"/>
+      </w:rPr>
+    </w:lvl>
+    <w:lvl w:ilvl="7" w:tentative="1">
+      <w:start w:val="1"/>
+      <w:numFmt w:val="bullet"/>
+      <w:lvlText w:val=""/>
+      <w:lvlJc w:val="left"/>
+      <w:pPr>
+        <w:tabs>
+          <w:tab w:val="num" w:pos="5760"/>
+        </w:tabs>
+        <w:ind w:left="5760" w:hanging="360"/>
+      </w:pPr>
+      <w:rPr>
+        <w:rFonts w:ascii="Wingdings" w:hAnsi="Wingdings" w:hint="default"/>
+        <w:sz w:val="20"/>
+      </w:rPr>
+    </w:lvl>
+    <w:lvl w:ilvl="8" w:tentative="1">
+      <w:start w:val="1"/>
+      <w:numFmt w:val="bullet"/>
+      <w:lvlText w:val=""/>
+      <w:lvlJc w:val="left"/>
+      <w:pPr>
+        <w:tabs>
+          <w:tab w:val="num" w:pos="6480"/>
+        </w:tabs>
+        <w:ind w:left="6480" w:hanging="360"/>
+      </w:pPr>
+      <w:rPr>
+        <w:rFonts w:ascii="Wingdings" w:hAnsi="Wingdings" w:hint="default"/>
+        <w:sz w:val="20"/>
+      </w:rPr>
+    </w:lvl>
+  </w:abstractNum>
+  <w:abstractNum w:abstractNumId="2" w15:restartNumberingAfterBreak="0">
+    <w:nsid w:val="0446136F"/>
+    <w:multiLevelType w:val="multilevel"/>
+    <w:tmpl w:val="90E061CA"/>
+    <w:lvl w:ilvl="0">
+      <w:start w:val="1"/>
+      <w:numFmt w:val="bullet"/>
+      <w:lvlText w:val=""/>
+      <w:lvlJc w:val="left"/>
+      <w:pPr>
+        <w:tabs>
+          <w:tab w:val="num" w:pos="720"/>
+        </w:tabs>
+        <w:ind w:left="720" w:hanging="360"/>
+      </w:pPr>
+      <w:rPr>
+        <w:rFonts w:ascii="Symbol" w:hAnsi="Symbol" w:hint="default"/>
+        <w:sz w:val="20"/>
+      </w:rPr>
+    </w:lvl>
+    <w:lvl w:ilvl="1" w:tentative="1">
+      <w:start w:val="1"/>
+      <w:numFmt w:val="bullet"/>
+      <w:lvlText w:val="o"/>
+      <w:lvlJc w:val="left"/>
+      <w:pPr>
+        <w:tabs>
+          <w:tab w:val="num" w:pos="1440"/>
+        </w:tabs>
+        <w:ind w:left="1440" w:hanging="360"/>
+      </w:pPr>
+      <w:rPr>
+        <w:rFonts w:ascii="Courier New" w:hAnsi="Courier New" w:hint="default"/>
+        <w:sz w:val="20"/>
+      </w:rPr>
+    </w:lvl>
+    <w:lvl w:ilvl="2" w:tentative="1">
+      <w:start w:val="1"/>
+      <w:numFmt w:val="bullet"/>
+      <w:lvlText w:val=""/>
+      <w:lvlJc w:val="left"/>
+      <w:pPr>
+        <w:tabs>
+          <w:tab w:val="num" w:pos="2160"/>
+        </w:tabs>
+        <w:ind w:left="2160" w:hanging="360"/>
+      </w:pPr>
+      <w:rPr>
+        <w:rFonts w:ascii="Wingdings" w:hAnsi="Wingdings" w:hint="default"/>
+        <w:sz w:val="20"/>
+      </w:rPr>
+    </w:lvl>
+    <w:lvl w:ilvl="3" w:tentative="1">
+      <w:start w:val="1"/>
+      <w:numFmt w:val="bullet"/>
+      <w:lvlText w:val=""/>
+      <w:lvlJc w:val="left"/>
+      <w:pPr>
+        <w:tabs>
+          <w:tab w:val="num" w:pos="2880"/>
+        </w:tabs>
+        <w:ind w:left="2880" w:hanging="360"/>
+      </w:pPr>
+      <w:rPr>
+        <w:rFonts w:ascii="Wingdings" w:hAnsi="Wingdings" w:hint="default"/>
+        <w:sz w:val="20"/>
+      </w:rPr>
+    </w:lvl>
+    <w:lvl w:ilvl="4" w:tentative="1">
+      <w:start w:val="1"/>
+      <w:numFmt w:val="bullet"/>
+      <w:lvlText w:val=""/>
+      <w:lvlJc w:val="left"/>
+      <w:pPr>
+        <w:tabs>
+          <w:tab w:val="num" w:pos="3600"/>
+        </w:tabs>
+        <w:ind w:left="3600" w:hanging="360"/>
+      </w:pPr>
+      <w:rPr>
+        <w:rFonts w:ascii="Wingdings" w:hAnsi="Wingdings" w:hint="default"/>
+        <w:sz w:val="20"/>
+      </w:rPr>
+    </w:lvl>
+    <w:lvl w:ilvl="5" w:tentative="1">
+      <w:start w:val="1"/>
+      <w:numFmt w:val="bullet"/>
+      <w:lvlText w:val=""/>
+      <w:lvlJc w:val="left"/>
+      <w:pPr>
+        <w:tabs>
+          <w:tab w:val="num" w:pos="4320"/>
+        </w:tabs>
+        <w:ind w:left="4320" w:hanging="360"/>
+      </w:pPr>
+      <w:rPr>
+        <w:rFonts w:ascii="Wingdings" w:hAnsi="Wingdings" w:hint="default"/>
+        <w:sz w:val="20"/>
+      </w:rPr>
+    </w:lvl>
+    <w:lvl w:ilvl="6" w:tentative="1">
+      <w:start w:val="1"/>
+      <w:numFmt w:val="bullet"/>
+      <w:lvlText w:val=""/>
+      <w:lvlJc w:val="left"/>
+      <w:pPr>
+        <w:tabs>
+          <w:tab w:val="num" w:pos="5040"/>
+        </w:tabs>
+        <w:ind w:left="5040" w:hanging="360"/>
+      </w:pPr>
+      <w:rPr>
+        <w:rFonts w:ascii="Wingdings" w:hAnsi="Wingdings" w:hint="default"/>
+        <w:sz w:val="20"/>
+      </w:rPr>
+    </w:lvl>
+    <w:lvl w:ilvl="7" w:tentative="1">
+      <w:start w:val="1"/>
+      <w:numFmt w:val="bullet"/>
+      <w:lvlText w:val=""/>
+      <w:lvlJc w:val="left"/>
+      <w:pPr>
+        <w:tabs>
+          <w:tab w:val="num" w:pos="5760"/>
+        </w:tabs>
+        <w:ind w:left="5760" w:hanging="360"/>
+      </w:pPr>
+      <w:rPr>
+        <w:rFonts w:ascii="Wingdings" w:hAnsi="Wingdings" w:hint="default"/>
+        <w:sz w:val="20"/>
+      </w:rPr>
+    </w:lvl>
+    <w:lvl w:ilvl="8" w:tentative="1">
+      <w:start w:val="1"/>
+      <w:numFmt w:val="bullet"/>
+      <w:lvlText w:val=""/>
+      <w:lvlJc w:val="left"/>
+      <w:pPr>
+        <w:tabs>
+          <w:tab w:val="num" w:pos="6480"/>
+        </w:tabs>
+        <w:ind w:left="6480" w:hanging="360"/>
+      </w:pPr>
+      <w:rPr>
+        <w:rFonts w:ascii="Wingdings" w:hAnsi="Wingdings" w:hint="default"/>
+        <w:sz w:val="20"/>
+      </w:rPr>
+    </w:lvl>
+  </w:abstractNum>
+  <w:abstractNum w:abstractNumId="3" w15:restartNumberingAfterBreak="0">
+    <w:nsid w:val="05AD64A2"/>
+    <w:multiLevelType w:val="multilevel"/>
+    <w:tmpl w:val="CFF0AABA"/>
+    <w:lvl w:ilvl="0">
+      <w:start w:val="1"/>
+      <w:numFmt w:val="bullet"/>
+      <w:lvlText w:val=""/>
+      <w:lvlJc w:val="left"/>
+      <w:pPr>
+        <w:tabs>
+          <w:tab w:val="num" w:pos="720"/>
+        </w:tabs>
+        <w:ind w:left="720" w:hanging="360"/>
+      </w:pPr>
+      <w:rPr>
+        <w:rFonts w:ascii="Symbol" w:hAnsi="Symbol" w:hint="default"/>
+        <w:sz w:val="20"/>
+      </w:rPr>
+    </w:lvl>
+    <w:lvl w:ilvl="1" w:tentative="1">
+      <w:start w:val="1"/>
+      <w:numFmt w:val="bullet"/>
+      <w:lvlText w:val="o"/>
+      <w:lvlJc w:val="left"/>
+      <w:pPr>
+        <w:tabs>
+          <w:tab w:val="num" w:pos="1440"/>
+        </w:tabs>
+        <w:ind w:left="1440" w:hanging="360"/>
+      </w:pPr>
+      <w:rPr>
+        <w:rFonts w:ascii="Courier New" w:hAnsi="Courier New" w:hint="default"/>
+        <w:sz w:val="20"/>
+      </w:rPr>
+    </w:lvl>
+    <w:lvl w:ilvl="2" w:tentative="1">
+      <w:start w:val="1"/>
+      <w:numFmt w:val="bullet"/>
+      <w:lvlText w:val=""/>
+      <w:lvlJc w:val="left"/>
+      <w:pPr>
+        <w:tabs>
+          <w:tab w:val="num" w:pos="2160"/>
+        </w:tabs>
+        <w:ind w:left="2160" w:hanging="360"/>
+      </w:pPr>
+      <w:rPr>
+        <w:rFonts w:ascii="Wingdings" w:hAnsi="Wingdings" w:hint="default"/>
+        <w:sz w:val="20"/>
+      </w:rPr>
+    </w:lvl>
+    <w:lvl w:ilvl="3" w:tentative="1">
+      <w:start w:val="1"/>
+      <w:numFmt w:val="bullet"/>
+      <w:lvlText w:val=""/>
+      <w:lvlJc w:val="left"/>
+      <w:pPr>
+        <w:tabs>
+          <w:tab w:val="num" w:pos="2880"/>
+        </w:tabs>
+        <w:ind w:left="2880" w:hanging="360"/>
+      </w:pPr>
+      <w:rPr>
+        <w:rFonts w:ascii="Wingdings" w:hAnsi="Wingdings" w:hint="default"/>
+        <w:sz w:val="20"/>
+      </w:rPr>
+    </w:lvl>
+    <w:lvl w:ilvl="4" w:tentative="1">
+      <w:start w:val="1"/>
+      <w:numFmt w:val="bullet"/>
+      <w:lvlText w:val=""/>
+      <w:lvlJc w:val="left"/>
+      <w:pPr>
+        <w:tabs>
+          <w:tab w:val="num" w:pos="3600"/>
+        </w:tabs>
+        <w:ind w:left="3600" w:hanging="360"/>
+      </w:pPr>
+      <w:rPr>
+        <w:rFonts w:ascii="Wingdings" w:hAnsi="Wingdings" w:hint="default"/>
+        <w:sz w:val="20"/>
+      </w:rPr>
+    </w:lvl>
+    <w:lvl w:ilvl="5" w:tentative="1">
+      <w:start w:val="1"/>
+      <w:numFmt w:val="bullet"/>
+      <w:lvlText w:val=""/>
+      <w:lvlJc w:val="left"/>
+      <w:pPr>
+        <w:tabs>
+          <w:tab w:val="num" w:pos="4320"/>
+        </w:tabs>
+        <w:ind w:left="4320" w:hanging="360"/>
+      </w:pPr>
+      <w:rPr>
+        <w:rFonts w:ascii="Wingdings" w:hAnsi="Wingdings" w:hint="default"/>
+        <w:sz w:val="20"/>
+      </w:rPr>
+    </w:lvl>
+    <w:lvl w:ilvl="6" w:tentative="1">
+      <w:start w:val="1"/>
+      <w:numFmt w:val="bullet"/>
+      <w:lvlText w:val=""/>
+      <w:lvlJc w:val="left"/>
+      <w:pPr>
+        <w:tabs>
+          <w:tab w:val="num" w:pos="5040"/>
+        </w:tabs>
+        <w:ind w:left="5040" w:hanging="360"/>
+      </w:pPr>
+      <w:rPr>
+        <w:rFonts w:ascii="Wingdings" w:hAnsi="Wingdings" w:hint="default"/>
+        <w:sz w:val="20"/>
+      </w:rPr>
+    </w:lvl>
+    <w:lvl w:ilvl="7" w:tentative="1">
+      <w:start w:val="1"/>
+      <w:numFmt w:val="bullet"/>
+      <w:lvlText w:val=""/>
+      <w:lvlJc w:val="left"/>
+      <w:pPr>
+        <w:tabs>
+          <w:tab w:val="num" w:pos="5760"/>
+        </w:tabs>
+        <w:ind w:left="5760" w:hanging="360"/>
+      </w:pPr>
+      <w:rPr>
+        <w:rFonts w:ascii="Wingdings" w:hAnsi="Wingdings" w:hint="default"/>
+        <w:sz w:val="20"/>
+      </w:rPr>
+    </w:lvl>
+    <w:lvl w:ilvl="8" w:tentative="1">
+      <w:start w:val="1"/>
+      <w:numFmt w:val="bullet"/>
+      <w:lvlText w:val=""/>
+      <w:lvlJc w:val="left"/>
+      <w:pPr>
+        <w:tabs>
+          <w:tab w:val="num" w:pos="6480"/>
+        </w:tabs>
+        <w:ind w:left="6480" w:hanging="360"/>
+      </w:pPr>
+      <w:rPr>
+        <w:rFonts w:ascii="Wingdings" w:hAnsi="Wingdings" w:hint="default"/>
+        <w:sz w:val="20"/>
+      </w:rPr>
+    </w:lvl>
+  </w:abstractNum>
+  <w:abstractNum w:abstractNumId="4" w15:restartNumberingAfterBreak="0">
+    <w:nsid w:val="11D423FE"/>
+    <w:multiLevelType w:val="multilevel"/>
+    <w:tmpl w:val="E22C6176"/>
+    <w:lvl w:ilvl="0">
+      <w:start w:val="1"/>
+      <w:numFmt w:val="bullet"/>
+      <w:lvlText w:val=""/>
+      <w:lvlJc w:val="left"/>
+      <w:pPr>
+        <w:tabs>
+          <w:tab w:val="num" w:pos="720"/>
+        </w:tabs>
+        <w:ind w:left="720" w:hanging="360"/>
+      </w:pPr>
+      <w:rPr>
+        <w:rFonts w:ascii="Symbol" w:hAnsi="Symbol" w:hint="default"/>
+        <w:sz w:val="20"/>
+      </w:rPr>
+    </w:lvl>
+    <w:lvl w:ilvl="1" w:tentative="1">
+      <w:start w:val="1"/>
+      <w:numFmt w:val="bullet"/>
+      <w:lvlText w:val="o"/>
+      <w:lvlJc w:val="left"/>
+      <w:pPr>
+        <w:tabs>
+          <w:tab w:val="num" w:pos="1440"/>
+        </w:tabs>
+        <w:ind w:left="1440" w:hanging="360"/>
+      </w:pPr>
+      <w:rPr>
+        <w:rFonts w:ascii="Courier New" w:hAnsi="Courier New" w:hint="default"/>
+        <w:sz w:val="20"/>
+      </w:rPr>
+    </w:lvl>
+    <w:lvl w:ilvl="2" w:tentative="1">
+      <w:start w:val="1"/>
+      <w:numFmt w:val="bullet"/>
+      <w:lvlText w:val=""/>
+      <w:lvlJc w:val="left"/>
+      <w:pPr>
+        <w:tabs>
+          <w:tab w:val="num" w:pos="2160"/>
+        </w:tabs>
+        <w:ind w:left="2160" w:hanging="360"/>
+      </w:pPr>
+      <w:rPr>
+        <w:rFonts w:ascii="Wingdings" w:hAnsi="Wingdings" w:hint="default"/>
+        <w:sz w:val="20"/>
+      </w:rPr>
+    </w:lvl>
+    <w:lvl w:ilvl="3" w:tentative="1">
+      <w:start w:val="1"/>
+      <w:numFmt w:val="bullet"/>
+      <w:lvlText w:val=""/>
+      <w:lvlJc w:val="left"/>
+      <w:pPr>
+        <w:tabs>
+          <w:tab w:val="num" w:pos="2880"/>
+        </w:tabs>
+        <w:ind w:left="2880" w:hanging="360"/>
+      </w:pPr>
+      <w:rPr>
+        <w:rFonts w:ascii="Wingdings" w:hAnsi="Wingdings" w:hint="default"/>
+        <w:sz w:val="20"/>
+      </w:rPr>
+    </w:lvl>
+    <w:lvl w:ilvl="4" w:tentative="1">
+      <w:start w:val="1"/>
+      <w:numFmt w:val="bullet"/>
+      <w:lvlText w:val=""/>
+      <w:lvlJc w:val="left"/>
+      <w:pPr>
+        <w:tabs>
+          <w:tab w:val="num" w:pos="3600"/>
+        </w:tabs>
+        <w:ind w:left="3600" w:hanging="360"/>
+      </w:pPr>
+      <w:rPr>
+        <w:rFonts w:ascii="Wingdings" w:hAnsi="Wingdings" w:hint="default"/>
+        <w:sz w:val="20"/>
+      </w:rPr>
+    </w:lvl>
+    <w:lvl w:ilvl="5" w:tentative="1">
+      <w:start w:val="1"/>
+      <w:numFmt w:val="bullet"/>
+      <w:lvlText w:val=""/>
+      <w:lvlJc w:val="left"/>
+      <w:pPr>
+        <w:tabs>
+          <w:tab w:val="num" w:pos="4320"/>
+        </w:tabs>
+        <w:ind w:left="4320" w:hanging="360"/>
+      </w:pPr>
+      <w:rPr>
+        <w:rFonts w:ascii="Wingdings" w:hAnsi="Wingdings" w:hint="default"/>
+        <w:sz w:val="20"/>
+      </w:rPr>
+    </w:lvl>
+    <w:lvl w:ilvl="6" w:tentative="1">
+      <w:start w:val="1"/>
+      <w:numFmt w:val="bullet"/>
+      <w:lvlText w:val=""/>
+      <w:lvlJc w:val="left"/>
+      <w:pPr>
+        <w:tabs>
+          <w:tab w:val="num" w:pos="5040"/>
+        </w:tabs>
+        <w:ind w:left="5040" w:hanging="360"/>
+      </w:pPr>
+      <w:rPr>
+        <w:rFonts w:ascii="Wingdings" w:hAnsi="Wingdings" w:hint="default"/>
+        <w:sz w:val="20"/>
+      </w:rPr>
+    </w:lvl>
+    <w:lvl w:ilvl="7" w:tentative="1">
+      <w:start w:val="1"/>
+      <w:numFmt w:val="bullet"/>
+      <w:lvlText w:val=""/>
+      <w:lvlJc w:val="left"/>
+      <w:pPr>
+        <w:tabs>
+          <w:tab w:val="num" w:pos="5760"/>
+        </w:tabs>
+        <w:ind w:left="5760" w:hanging="360"/>
+      </w:pPr>
+      <w:rPr>
+        <w:rFonts w:ascii="Wingdings" w:hAnsi="Wingdings" w:hint="default"/>
+        <w:sz w:val="20"/>
+      </w:rPr>
+    </w:lvl>
+    <w:lvl w:ilvl="8" w:tentative="1">
+      <w:start w:val="1"/>
+      <w:numFmt w:val="bullet"/>
+      <w:lvlText w:val=""/>
+      <w:lvlJc w:val="left"/>
+      <w:pPr>
+        <w:tabs>
+          <w:tab w:val="num" w:pos="6480"/>
+        </w:tabs>
+        <w:ind w:left="6480" w:hanging="360"/>
+      </w:pPr>
+      <w:rPr>
+        <w:rFonts w:ascii="Wingdings" w:hAnsi="Wingdings" w:hint="default"/>
+        <w:sz w:val="20"/>
+      </w:rPr>
+    </w:lvl>
+  </w:abstractNum>
+  <w:abstractNum w:abstractNumId="5" w15:restartNumberingAfterBreak="0">
+    <w:nsid w:val="146800D7"/>
+    <w:multiLevelType w:val="multilevel"/>
+    <w:tmpl w:val="BEE02B80"/>
+    <w:lvl w:ilvl="0">
+      <w:start w:val="1"/>
+      <w:numFmt w:val="bullet"/>
+      <w:lvlText w:val=""/>
+      <w:lvlJc w:val="left"/>
+      <w:pPr>
+        <w:tabs>
+          <w:tab w:val="num" w:pos="720"/>
+        </w:tabs>
+        <w:ind w:left="720" w:hanging="360"/>
+      </w:pPr>
+      <w:rPr>
+        <w:rFonts w:ascii="Symbol" w:hAnsi="Symbol" w:hint="default"/>
+        <w:sz w:val="20"/>
+      </w:rPr>
+    </w:lvl>
+    <w:lvl w:ilvl="1" w:tentative="1">
+      <w:start w:val="1"/>
+      <w:numFmt w:val="bullet"/>
+      <w:lvlText w:val="o"/>
+      <w:lvlJc w:val="left"/>
+      <w:pPr>
+        <w:tabs>
+          <w:tab w:val="num" w:pos="1440"/>
+        </w:tabs>
+        <w:ind w:left="1440" w:hanging="360"/>
+      </w:pPr>
+      <w:rPr>
+        <w:rFonts w:ascii="Courier New" w:hAnsi="Courier New" w:hint="default"/>
+        <w:sz w:val="20"/>
+      </w:rPr>
+    </w:lvl>
+    <w:lvl w:ilvl="2" w:tentative="1">
+      <w:start w:val="1"/>
+      <w:numFmt w:val="bullet"/>
+      <w:lvlText w:val=""/>
+      <w:lvlJc w:val="left"/>
+      <w:pPr>
+        <w:tabs>
+          <w:tab w:val="num" w:pos="2160"/>
+        </w:tabs>
+        <w:ind w:left="2160" w:hanging="360"/>
+      </w:pPr>
+      <w:rPr>
+        <w:rFonts w:ascii="Wingdings" w:hAnsi="Wingdings" w:hint="default"/>
+        <w:sz w:val="20"/>
+      </w:rPr>
+    </w:lvl>
+    <w:lvl w:ilvl="3" w:tentative="1">
+      <w:start w:val="1"/>
+      <w:numFmt w:val="bullet"/>
+      <w:lvlText w:val=""/>
+      <w:lvlJc w:val="left"/>
+      <w:pPr>
+        <w:tabs>
+          <w:tab w:val="num" w:pos="2880"/>
+        </w:tabs>
+        <w:ind w:left="2880" w:hanging="360"/>
+      </w:pPr>
+      <w:rPr>
+        <w:rFonts w:ascii="Wingdings" w:hAnsi="Wingdings" w:hint="default"/>
+        <w:sz w:val="20"/>
+      </w:rPr>
+    </w:lvl>
+    <w:lvl w:ilvl="4" w:tentative="1">
+      <w:start w:val="1"/>
+      <w:numFmt w:val="bullet"/>
+      <w:lvlText w:val=""/>
+      <w:lvlJc w:val="left"/>
+      <w:pPr>
+        <w:tabs>
+          <w:tab w:val="num" w:pos="3600"/>
+        </w:tabs>
+        <w:ind w:left="3600" w:hanging="360"/>
+      </w:pPr>
+      <w:rPr>
+        <w:rFonts w:ascii="Wingdings" w:hAnsi="Wingdings" w:hint="default"/>
+        <w:sz w:val="20"/>
+      </w:rPr>
+    </w:lvl>
+    <w:lvl w:ilvl="5" w:tentative="1">
+      <w:start w:val="1"/>
+      <w:numFmt w:val="bullet"/>
+      <w:lvlText w:val=""/>
+      <w:lvlJc w:val="left"/>
+      <w:pPr>
+        <w:tabs>
+          <w:tab w:val="num" w:pos="4320"/>
+        </w:tabs>
+        <w:ind w:left="4320" w:hanging="360"/>
+      </w:pPr>
+      <w:rPr>
+        <w:rFonts w:ascii="Wingdings" w:hAnsi="Wingdings" w:hint="default"/>
+        <w:sz w:val="20"/>
+      </w:rPr>
+    </w:lvl>
+    <w:lvl w:ilvl="6" w:tentative="1">
+      <w:start w:val="1"/>
+      <w:numFmt w:val="bullet"/>
+      <w:lvlText w:val=""/>
+      <w:lvlJc w:val="left"/>
+      <w:pPr>
+        <w:tabs>
+          <w:tab w:val="num" w:pos="5040"/>
+        </w:tabs>
+        <w:ind w:left="5040" w:hanging="360"/>
+      </w:pPr>
+      <w:rPr>
+        <w:rFonts w:ascii="Wingdings" w:hAnsi="Wingdings" w:hint="default"/>
+        <w:sz w:val="20"/>
+      </w:rPr>
+    </w:lvl>
+    <w:lvl w:ilvl="7" w:tentative="1">
+      <w:start w:val="1"/>
+      <w:numFmt w:val="bullet"/>
+      <w:lvlText w:val=""/>
+      <w:lvlJc w:val="left"/>
+      <w:pPr>
+        <w:tabs>
+          <w:tab w:val="num" w:pos="5760"/>
+        </w:tabs>
+        <w:ind w:left="5760" w:hanging="360"/>
+      </w:pPr>
+      <w:rPr>
+        <w:rFonts w:ascii="Wingdings" w:hAnsi="Wingdings" w:hint="default"/>
+        <w:sz w:val="20"/>
+      </w:rPr>
+    </w:lvl>
+    <w:lvl w:ilvl="8" w:tentative="1">
+      <w:start w:val="1"/>
+      <w:numFmt w:val="bullet"/>
+      <w:lvlText w:val=""/>
+      <w:lvlJc w:val="left"/>
+      <w:pPr>
+        <w:tabs>
+          <w:tab w:val="num" w:pos="6480"/>
+        </w:tabs>
+        <w:ind w:left="6480" w:hanging="360"/>
+      </w:pPr>
+      <w:rPr>
+        <w:rFonts w:ascii="Wingdings" w:hAnsi="Wingdings" w:hint="default"/>
+        <w:sz w:val="20"/>
+      </w:rPr>
+    </w:lvl>
+  </w:abstractNum>
+  <w:abstractNum w:abstractNumId="6" w15:restartNumberingAfterBreak="0">
+    <w:nsid w:val="1F8912B4"/>
+    <w:multiLevelType w:val="multilevel"/>
+    <w:tmpl w:val="482AF026"/>
+    <w:lvl w:ilvl="0">
+      <w:start w:val="1"/>
+      <w:numFmt w:val="bullet"/>
+      <w:lvlText w:val=""/>
+      <w:lvlJc w:val="left"/>
+      <w:pPr>
+        <w:tabs>
+          <w:tab w:val="num" w:pos="720"/>
+        </w:tabs>
+        <w:ind w:left="720" w:hanging="360"/>
+      </w:pPr>
+      <w:rPr>
+        <w:rFonts w:ascii="Symbol" w:hAnsi="Symbol" w:hint="default"/>
+        <w:sz w:val="20"/>
+      </w:rPr>
+    </w:lvl>
+    <w:lvl w:ilvl="1" w:tentative="1">
+      <w:start w:val="1"/>
+      <w:numFmt w:val="bullet"/>
+      <w:lvlText w:val="o"/>
+      <w:lvlJc w:val="left"/>
+      <w:pPr>
+        <w:tabs>
+          <w:tab w:val="num" w:pos="1440"/>
+        </w:tabs>
+        <w:ind w:left="1440" w:hanging="360"/>
+      </w:pPr>
+      <w:rPr>
+        <w:rFonts w:ascii="Courier New" w:hAnsi="Courier New" w:hint="default"/>
+        <w:sz w:val="20"/>
+      </w:rPr>
+    </w:lvl>
+    <w:lvl w:ilvl="2" w:tentative="1">
+      <w:start w:val="1"/>
+      <w:numFmt w:val="bullet"/>
+      <w:lvlText w:val=""/>
+      <w:lvlJc w:val="left"/>
+      <w:pPr>
+        <w:tabs>
+          <w:tab w:val="num" w:pos="2160"/>
+        </w:tabs>
+        <w:ind w:left="2160" w:hanging="360"/>
+      </w:pPr>
+      <w:rPr>
+        <w:rFonts w:ascii="Wingdings" w:hAnsi="Wingdings" w:hint="default"/>
+        <w:sz w:val="20"/>
+      </w:rPr>
+    </w:lvl>
+    <w:lvl w:ilvl="3" w:tentative="1">
+      <w:start w:val="1"/>
+      <w:numFmt w:val="bullet"/>
+      <w:lvlText w:val=""/>
+      <w:lvlJc w:val="left"/>
+      <w:pPr>
+        <w:tabs>
+          <w:tab w:val="num" w:pos="2880"/>
+        </w:tabs>
+        <w:ind w:left="2880" w:hanging="360"/>
+      </w:pPr>
+      <w:rPr>
+        <w:rFonts w:ascii="Wingdings" w:hAnsi="Wingdings" w:hint="default"/>
+        <w:sz w:val="20"/>
+      </w:rPr>
+    </w:lvl>
+    <w:lvl w:ilvl="4" w:tentative="1">
+      <w:start w:val="1"/>
+      <w:numFmt w:val="bullet"/>
+      <w:lvlText w:val=""/>
+      <w:lvlJc w:val="left"/>
+      <w:pPr>
+        <w:tabs>
+          <w:tab w:val="num" w:pos="3600"/>
+        </w:tabs>
+        <w:ind w:left="3600" w:hanging="360"/>
+      </w:pPr>
+      <w:rPr>
+        <w:rFonts w:ascii="Wingdings" w:hAnsi="Wingdings" w:hint="default"/>
+        <w:sz w:val="20"/>
+      </w:rPr>
+    </w:lvl>
+    <w:lvl w:ilvl="5" w:tentative="1">
+      <w:start w:val="1"/>
+      <w:numFmt w:val="bullet"/>
+      <w:lvlText w:val=""/>
+      <w:lvlJc w:val="left"/>
+      <w:pPr>
+        <w:tabs>
+          <w:tab w:val="num" w:pos="4320"/>
+        </w:tabs>
+        <w:ind w:left="4320" w:hanging="360"/>
+      </w:pPr>
+      <w:rPr>
+        <w:rFonts w:ascii="Wingdings" w:hAnsi="Wingdings" w:hint="default"/>
+        <w:sz w:val="20"/>
+      </w:rPr>
+    </w:lvl>
+    <w:lvl w:ilvl="6" w:tentative="1">
+      <w:start w:val="1"/>
+      <w:numFmt w:val="bullet"/>
+      <w:lvlText w:val=""/>
+      <w:lvlJc w:val="left"/>
+      <w:pPr>
+        <w:tabs>
+          <w:tab w:val="num" w:pos="5040"/>
+        </w:tabs>
+        <w:ind w:left="5040" w:hanging="360"/>
+      </w:pPr>
+      <w:rPr>
+        <w:rFonts w:ascii="Wingdings" w:hAnsi="Wingdings" w:hint="default"/>
+        <w:sz w:val="20"/>
+      </w:rPr>
+    </w:lvl>
+    <w:lvl w:ilvl="7" w:tentative="1">
+      <w:start w:val="1"/>
+      <w:numFmt w:val="bullet"/>
+      <w:lvlText w:val=""/>
+      <w:lvlJc w:val="left"/>
+      <w:pPr>
+        <w:tabs>
+          <w:tab w:val="num" w:pos="5760"/>
+        </w:tabs>
+        <w:ind w:left="5760" w:hanging="360"/>
+      </w:pPr>
+      <w:rPr>
+        <w:rFonts w:ascii="Wingdings" w:hAnsi="Wingdings" w:hint="default"/>
+        <w:sz w:val="20"/>
+      </w:rPr>
+    </w:lvl>
+    <w:lvl w:ilvl="8" w:tentative="1">
+      <w:start w:val="1"/>
+      <w:numFmt w:val="bullet"/>
+      <w:lvlText w:val=""/>
+      <w:lvlJc w:val="left"/>
+      <w:pPr>
+        <w:tabs>
+          <w:tab w:val="num" w:pos="6480"/>
+        </w:tabs>
+        <w:ind w:left="6480" w:hanging="360"/>
+      </w:pPr>
+      <w:rPr>
+        <w:rFonts w:ascii="Wingdings" w:hAnsi="Wingdings" w:hint="default"/>
+        <w:sz w:val="20"/>
+      </w:rPr>
+    </w:lvl>
+  </w:abstractNum>
+  <w:abstractNum w:abstractNumId="7" w15:restartNumberingAfterBreak="0">
+    <w:nsid w:val="2B1E66D8"/>
+    <w:multiLevelType w:val="multilevel"/>
+    <w:tmpl w:val="519ADF0C"/>
+    <w:lvl w:ilvl="0">
+      <w:start w:val="1"/>
+      <w:numFmt w:val="bullet"/>
+      <w:lvlText w:val=""/>
+      <w:lvlJc w:val="left"/>
+      <w:pPr>
+        <w:tabs>
+          <w:tab w:val="num" w:pos="720"/>
+        </w:tabs>
+        <w:ind w:left="720" w:hanging="360"/>
+      </w:pPr>
+      <w:rPr>
+        <w:rFonts w:ascii="Symbol" w:hAnsi="Symbol" w:hint="default"/>
+        <w:sz w:val="20"/>
+      </w:rPr>
+    </w:lvl>
+    <w:lvl w:ilvl="1" w:tentative="1">
+      <w:start w:val="1"/>
+      <w:numFmt w:val="bullet"/>
+      <w:lvlText w:val="o"/>
+      <w:lvlJc w:val="left"/>
+      <w:pPr>
+        <w:tabs>
+          <w:tab w:val="num" w:pos="1440"/>
+        </w:tabs>
+        <w:ind w:left="1440" w:hanging="360"/>
+      </w:pPr>
+      <w:rPr>
+        <w:rFonts w:ascii="Courier New" w:hAnsi="Courier New" w:hint="default"/>
+        <w:sz w:val="20"/>
+      </w:rPr>
+    </w:lvl>
+    <w:lvl w:ilvl="2" w:tentative="1">
+      <w:start w:val="1"/>
+      <w:numFmt w:val="bullet"/>
+      <w:lvlText w:val=""/>
+      <w:lvlJc w:val="left"/>
+      <w:pPr>
+        <w:tabs>
+          <w:tab w:val="num" w:pos="2160"/>
+        </w:tabs>
+        <w:ind w:left="2160" w:hanging="360"/>
+      </w:pPr>
+      <w:rPr>
+        <w:rFonts w:ascii="Wingdings" w:hAnsi="Wingdings" w:hint="default"/>
+        <w:sz w:val="20"/>
+      </w:rPr>
+    </w:lvl>
+    <w:lvl w:ilvl="3" w:tentative="1">
+      <w:start w:val="1"/>
+      <w:numFmt w:val="bullet"/>
+      <w:lvlText w:val=""/>
+      <w:lvlJc w:val="left"/>
+      <w:pPr>
+        <w:tabs>
+          <w:tab w:val="num" w:pos="2880"/>
+        </w:tabs>
+        <w:ind w:left="2880" w:hanging="360"/>
+      </w:pPr>
+      <w:rPr>
+        <w:rFonts w:ascii="Wingdings" w:hAnsi="Wingdings" w:hint="default"/>
+        <w:sz w:val="20"/>
+      </w:rPr>
+    </w:lvl>
+    <w:lvl w:ilvl="4" w:tentative="1">
+      <w:start w:val="1"/>
+      <w:numFmt w:val="bullet"/>
+      <w:lvlText w:val=""/>
+      <w:lvlJc w:val="left"/>
+      <w:pPr>
+        <w:tabs>
+          <w:tab w:val="num" w:pos="3600"/>
+        </w:tabs>
+        <w:ind w:left="3600" w:hanging="360"/>
+      </w:pPr>
+      <w:rPr>
+        <w:rFonts w:ascii="Wingdings" w:hAnsi="Wingdings" w:hint="default"/>
+        <w:sz w:val="20"/>
+      </w:rPr>
+    </w:lvl>
+    <w:lvl w:ilvl="5" w:tentative="1">
+      <w:start w:val="1"/>
+      <w:numFmt w:val="bullet"/>
+      <w:lvlText w:val=""/>
+      <w:lvlJc w:val="left"/>
+      <w:pPr>
+        <w:tabs>
+          <w:tab w:val="num" w:pos="4320"/>
+        </w:tabs>
+        <w:ind w:left="4320" w:hanging="360"/>
+      </w:pPr>
+      <w:rPr>
+        <w:rFonts w:ascii="Wingdings" w:hAnsi="Wingdings" w:hint="default"/>
+        <w:sz w:val="20"/>
+      </w:rPr>
+    </w:lvl>
+    <w:lvl w:ilvl="6" w:tentative="1">
+      <w:start w:val="1"/>
+      <w:numFmt w:val="bullet"/>
+      <w:lvlText w:val=""/>
+      <w:lvlJc w:val="left"/>
+      <w:pPr>
+        <w:tabs>
+          <w:tab w:val="num" w:pos="5040"/>
+        </w:tabs>
+        <w:ind w:left="5040" w:hanging="360"/>
+      </w:pPr>
+      <w:rPr>
+        <w:rFonts w:ascii="Wingdings" w:hAnsi="Wingdings" w:hint="default"/>
+        <w:sz w:val="20"/>
+      </w:rPr>
+    </w:lvl>
+    <w:lvl w:ilvl="7" w:tentative="1">
+      <w:start w:val="1"/>
+      <w:numFmt w:val="bullet"/>
+      <w:lvlText w:val=""/>
+      <w:lvlJc w:val="left"/>
+      <w:pPr>
+        <w:tabs>
+          <w:tab w:val="num" w:pos="5760"/>
+        </w:tabs>
+        <w:ind w:left="5760" w:hanging="360"/>
+      </w:pPr>
+      <w:rPr>
+        <w:rFonts w:ascii="Wingdings" w:hAnsi="Wingdings" w:hint="default"/>
+        <w:sz w:val="20"/>
+      </w:rPr>
+    </w:lvl>
+    <w:lvl w:ilvl="8" w:tentative="1">
+      <w:start w:val="1"/>
+      <w:numFmt w:val="bullet"/>
+      <w:lvlText w:val=""/>
+      <w:lvlJc w:val="left"/>
+      <w:pPr>
+        <w:tabs>
+          <w:tab w:val="num" w:pos="6480"/>
+        </w:tabs>
+        <w:ind w:left="6480" w:hanging="360"/>
+      </w:pPr>
+      <w:rPr>
+        <w:rFonts w:ascii="Wingdings" w:hAnsi="Wingdings" w:hint="default"/>
+        <w:sz w:val="20"/>
+      </w:rPr>
+    </w:lvl>
+  </w:abstractNum>
+  <w:abstractNum w:abstractNumId="8" w15:restartNumberingAfterBreak="0">
+    <w:nsid w:val="3C996933"/>
+    <w:multiLevelType w:val="multilevel"/>
+    <w:tmpl w:val="19D6879E"/>
+    <w:lvl w:ilvl="0">
+      <w:start w:val="1"/>
+      <w:numFmt w:val="bullet"/>
+      <w:lvlText w:val=""/>
+      <w:lvlJc w:val="left"/>
+      <w:pPr>
+        <w:tabs>
+          <w:tab w:val="num" w:pos="720"/>
+        </w:tabs>
+        <w:ind w:left="720" w:hanging="360"/>
+      </w:pPr>
+      <w:rPr>
+        <w:rFonts w:ascii="Symbol" w:hAnsi="Symbol" w:hint="default"/>
+        <w:sz w:val="20"/>
+      </w:rPr>
+    </w:lvl>
+    <w:lvl w:ilvl="1" w:tentative="1">
+      <w:start w:val="1"/>
+      <w:numFmt w:val="bullet"/>
+      <w:lvlText w:val="o"/>
+      <w:lvlJc w:val="left"/>
+      <w:pPr>
+        <w:tabs>
+          <w:tab w:val="num" w:pos="1440"/>
+        </w:tabs>
+        <w:ind w:left="1440" w:hanging="360"/>
+      </w:pPr>
+      <w:rPr>
+        <w:rFonts w:ascii="Courier New" w:hAnsi="Courier New" w:hint="default"/>
+        <w:sz w:val="20"/>
+      </w:rPr>
+    </w:lvl>
+    <w:lvl w:ilvl="2" w:tentative="1">
+      <w:start w:val="1"/>
+      <w:numFmt w:val="bullet"/>
+      <w:lvlText w:val=""/>
+      <w:lvlJc w:val="left"/>
+      <w:pPr>
+        <w:tabs>
+          <w:tab w:val="num" w:pos="2160"/>
+        </w:tabs>
+        <w:ind w:left="2160" w:hanging="360"/>
+      </w:pPr>
+      <w:rPr>
+        <w:rFonts w:ascii="Wingdings" w:hAnsi="Wingdings" w:hint="default"/>
+        <w:sz w:val="20"/>
+      </w:rPr>
+    </w:lvl>
+    <w:lvl w:ilvl="3" w:tentative="1">
+      <w:start w:val="1"/>
+      <w:numFmt w:val="bullet"/>
+      <w:lvlText w:val=""/>
+      <w:lvlJc w:val="left"/>
+      <w:pPr>
+        <w:tabs>
+          <w:tab w:val="num" w:pos="2880"/>
+        </w:tabs>
+        <w:ind w:left="2880" w:hanging="360"/>
+      </w:pPr>
+      <w:rPr>
+        <w:rFonts w:ascii="Wingdings" w:hAnsi="Wingdings" w:hint="default"/>
+        <w:sz w:val="20"/>
+      </w:rPr>
+    </w:lvl>
+    <w:lvl w:ilvl="4" w:tentative="1">
+      <w:start w:val="1"/>
+      <w:numFmt w:val="bullet"/>
+      <w:lvlText w:val=""/>
+      <w:lvlJc w:val="left"/>
+      <w:pPr>
+        <w:tabs>
+          <w:tab w:val="num" w:pos="3600"/>
+        </w:tabs>
+        <w:ind w:left="3600" w:hanging="360"/>
+      </w:pPr>
+      <w:rPr>
+        <w:rFonts w:ascii="Wingdings" w:hAnsi="Wingdings" w:hint="default"/>
+        <w:sz w:val="20"/>
+      </w:rPr>
+    </w:lvl>
+    <w:lvl w:ilvl="5" w:tentative="1">
+      <w:start w:val="1"/>
+      <w:numFmt w:val="bullet"/>
+      <w:lvlText w:val=""/>
+      <w:lvlJc w:val="left"/>
+      <w:pPr>
+        <w:tabs>
+          <w:tab w:val="num" w:pos="4320"/>
+        </w:tabs>
+        <w:ind w:left="4320" w:hanging="360"/>
+      </w:pPr>
+      <w:rPr>
+        <w:rFonts w:ascii="Wingdings" w:hAnsi="Wingdings" w:hint="default"/>
+        <w:sz w:val="20"/>
+      </w:rPr>
+    </w:lvl>
+    <w:lvl w:ilvl="6" w:tentative="1">
+      <w:start w:val="1"/>
+      <w:numFmt w:val="bullet"/>
+      <w:lvlText w:val=""/>
+      <w:lvlJc w:val="left"/>
+      <w:pPr>
+        <w:tabs>
+          <w:tab w:val="num" w:pos="5040"/>
+        </w:tabs>
+        <w:ind w:left="5040" w:hanging="360"/>
+      </w:pPr>
+      <w:rPr>
+        <w:rFonts w:ascii="Wingdings" w:hAnsi="Wingdings" w:hint="default"/>
+        <w:sz w:val="20"/>
+      </w:rPr>
+    </w:lvl>
+    <w:lvl w:ilvl="7" w:tentative="1">
+      <w:start w:val="1"/>
+      <w:numFmt w:val="bullet"/>
+      <w:lvlText w:val=""/>
+      <w:lvlJc w:val="left"/>
+      <w:pPr>
+        <w:tabs>
+          <w:tab w:val="num" w:pos="5760"/>
+        </w:tabs>
+        <w:ind w:left="5760" w:hanging="360"/>
+      </w:pPr>
+      <w:rPr>
+        <w:rFonts w:ascii="Wingdings" w:hAnsi="Wingdings" w:hint="default"/>
+        <w:sz w:val="20"/>
+      </w:rPr>
+    </w:lvl>
+    <w:lvl w:ilvl="8" w:tentative="1">
+      <w:start w:val="1"/>
+      <w:numFmt w:val="bullet"/>
+      <w:lvlText w:val=""/>
+      <w:lvlJc w:val="left"/>
+      <w:pPr>
+        <w:tabs>
+          <w:tab w:val="num" w:pos="6480"/>
+        </w:tabs>
+        <w:ind w:left="6480" w:hanging="360"/>
+      </w:pPr>
+      <w:rPr>
+        <w:rFonts w:ascii="Wingdings" w:hAnsi="Wingdings" w:hint="default"/>
+        <w:sz w:val="20"/>
+      </w:rPr>
+    </w:lvl>
+  </w:abstractNum>
+  <w:abstractNum w:abstractNumId="9" w15:restartNumberingAfterBreak="0">
+    <w:nsid w:val="423532BE"/>
+    <w:multiLevelType w:val="multilevel"/>
+    <w:tmpl w:val="9B4AFB12"/>
+    <w:lvl w:ilvl="0">
+      <w:start w:val="1"/>
+      <w:numFmt w:val="bullet"/>
+      <w:lvlText w:val=""/>
+      <w:lvlJc w:val="left"/>
+      <w:pPr>
+        <w:tabs>
+          <w:tab w:val="num" w:pos="720"/>
+        </w:tabs>
+        <w:ind w:left="720" w:hanging="360"/>
+      </w:pPr>
+      <w:rPr>
+        <w:rFonts w:ascii="Symbol" w:hAnsi="Symbol" w:hint="default"/>
+        <w:sz w:val="20"/>
+      </w:rPr>
+    </w:lvl>
+    <w:lvl w:ilvl="1" w:tentative="1">
+      <w:start w:val="1"/>
+      <w:numFmt w:val="bullet"/>
+      <w:lvlText w:val="o"/>
+      <w:lvlJc w:val="left"/>
+      <w:pPr>
+        <w:tabs>
+          <w:tab w:val="num" w:pos="1440"/>
+        </w:tabs>
+        <w:ind w:left="1440" w:hanging="360"/>
+      </w:pPr>
+      <w:rPr>
+        <w:rFonts w:ascii="Courier New" w:hAnsi="Courier New" w:hint="default"/>
+        <w:sz w:val="20"/>
+      </w:rPr>
+    </w:lvl>
+    <w:lvl w:ilvl="2" w:tentative="1">
+      <w:start w:val="1"/>
+      <w:numFmt w:val="bullet"/>
+      <w:lvlText w:val=""/>
+      <w:lvlJc w:val="left"/>
+      <w:pPr>
+        <w:tabs>
+          <w:tab w:val="num" w:pos="2160"/>
+        </w:tabs>
+        <w:ind w:left="2160" w:hanging="360"/>
+      </w:pPr>
+      <w:rPr>
+        <w:rFonts w:ascii="Wingdings" w:hAnsi="Wingdings" w:hint="default"/>
+        <w:sz w:val="20"/>
+      </w:rPr>
+    </w:lvl>
+    <w:lvl w:ilvl="3" w:tentative="1">
+      <w:start w:val="1"/>
+      <w:numFmt w:val="bullet"/>
+      <w:lvlText w:val=""/>
+      <w:lvlJc w:val="left"/>
+      <w:pPr>
+        <w:tabs>
+          <w:tab w:val="num" w:pos="2880"/>
+        </w:tabs>
+        <w:ind w:left="2880" w:hanging="360"/>
+      </w:pPr>
+      <w:rPr>
+        <w:rFonts w:ascii="Wingdings" w:hAnsi="Wingdings" w:hint="default"/>
+        <w:sz w:val="20"/>
+      </w:rPr>
+    </w:lvl>
+    <w:lvl w:ilvl="4" w:tentative="1">
+      <w:start w:val="1"/>
+      <w:numFmt w:val="bullet"/>
+      <w:lvlText w:val=""/>
+      <w:lvlJc w:val="left"/>
+      <w:pPr>
+        <w:tabs>
+          <w:tab w:val="num" w:pos="3600"/>
+        </w:tabs>
+        <w:ind w:left="3600" w:hanging="360"/>
+      </w:pPr>
+      <w:rPr>
+        <w:rFonts w:ascii="Wingdings" w:hAnsi="Wingdings" w:hint="default"/>
+        <w:sz w:val="20"/>
+      </w:rPr>
+    </w:lvl>
+    <w:lvl w:ilvl="5" w:tentative="1">
+      <w:start w:val="1"/>
+      <w:numFmt w:val="bullet"/>
+      <w:lvlText w:val=""/>
+      <w:lvlJc w:val="left"/>
+      <w:pPr>
+        <w:tabs>
+          <w:tab w:val="num" w:pos="4320"/>
+        </w:tabs>
+        <w:ind w:left="4320" w:hanging="360"/>
+      </w:pPr>
+      <w:rPr>
+        <w:rFonts w:ascii="Wingdings" w:hAnsi="Wingdings" w:hint="default"/>
+        <w:sz w:val="20"/>
+      </w:rPr>
+    </w:lvl>
+    <w:lvl w:ilvl="6" w:tentative="1">
+      <w:start w:val="1"/>
+      <w:numFmt w:val="bullet"/>
+      <w:lvlText w:val=""/>
+      <w:lvlJc w:val="left"/>
+      <w:pPr>
+        <w:tabs>
+          <w:tab w:val="num" w:pos="5040"/>
+        </w:tabs>
+        <w:ind w:left="5040" w:hanging="360"/>
+      </w:pPr>
+      <w:rPr>
+        <w:rFonts w:ascii="Wingdings" w:hAnsi="Wingdings" w:hint="default"/>
+        <w:sz w:val="20"/>
+      </w:rPr>
+    </w:lvl>
+    <w:lvl w:ilvl="7" w:tentative="1">
+      <w:start w:val="1"/>
+      <w:numFmt w:val="bullet"/>
+      <w:lvlText w:val=""/>
+      <w:lvlJc w:val="left"/>
+      <w:pPr>
+        <w:tabs>
+          <w:tab w:val="num" w:pos="5760"/>
+        </w:tabs>
+        <w:ind w:left="5760" w:hanging="360"/>
+      </w:pPr>
+      <w:rPr>
+        <w:rFonts w:ascii="Wingdings" w:hAnsi="Wingdings" w:hint="default"/>
+        <w:sz w:val="20"/>
+      </w:rPr>
+    </w:lvl>
+    <w:lvl w:ilvl="8" w:tentative="1">
+      <w:start w:val="1"/>
+      <w:numFmt w:val="bullet"/>
+      <w:lvlText w:val=""/>
+      <w:lvlJc w:val="left"/>
+      <w:pPr>
+        <w:tabs>
+          <w:tab w:val="num" w:pos="6480"/>
+        </w:tabs>
+        <w:ind w:left="6480" w:hanging="360"/>
+      </w:pPr>
+      <w:rPr>
+        <w:rFonts w:ascii="Wingdings" w:hAnsi="Wingdings" w:hint="default"/>
+        <w:sz w:val="20"/>
+      </w:rPr>
+    </w:lvl>
+  </w:abstractNum>
+  <w:abstractNum w:abstractNumId="10" w15:restartNumberingAfterBreak="0">
+    <w:nsid w:val="48163BB2"/>
+    <w:multiLevelType w:val="hybridMultilevel"/>
+    <w:tmpl w:val="C5861DE4"/>
+    <w:lvl w:ilvl="0" w:tplc="63ECC4A0">
+      <w:numFmt w:val="bullet"/>
+      <w:lvlText w:val="-"/>
+      <w:lvlJc w:val="left"/>
+      <w:pPr>
+        <w:ind w:left="720" w:hanging="360"/>
+      </w:pPr>
+      <w:rPr>
+        <w:rFonts w:ascii="Aptos" w:eastAsiaTheme="minorHAnsi" w:hAnsi="Aptos" w:cstheme="minorBidi" w:hint="default"/>
+      </w:rPr>
+    </w:lvl>
+    <w:lvl w:ilvl="1" w:tplc="100A0003" w:tentative="1">
+      <w:start w:val="1"/>
+      <w:numFmt w:val="bullet"/>
+      <w:lvlText w:val="o"/>
+      <w:lvlJc w:val="left"/>
+      <w:pPr>
+        <w:ind w:left="1440" w:hanging="360"/>
+      </w:pPr>
+      <w:rPr>
+        <w:rFonts w:ascii="Courier New" w:hAnsi="Courier New" w:cs="Courier New" w:hint="default"/>
+      </w:rPr>
+    </w:lvl>
+    <w:lvl w:ilvl="2" w:tplc="100A0005" w:tentative="1">
+      <w:start w:val="1"/>
+      <w:numFmt w:val="bullet"/>
+      <w:lvlText w:val=""/>
+      <w:lvlJc w:val="left"/>
+      <w:pPr>
+        <w:ind w:left="2160" w:hanging="360"/>
+      </w:pPr>
+      <w:rPr>
+        <w:rFonts w:ascii="Wingdings" w:hAnsi="Wingdings" w:hint="default"/>
+      </w:rPr>
+    </w:lvl>
+    <w:lvl w:ilvl="3" w:tplc="100A0001" w:tentative="1">
+      <w:start w:val="1"/>
+      <w:numFmt w:val="bullet"/>
+      <w:lvlText w:val=""/>
+      <w:lvlJc w:val="left"/>
+      <w:pPr>
+        <w:ind w:left="2880" w:hanging="360"/>
+      </w:pPr>
+      <w:rPr>
+        <w:rFonts w:ascii="Symbol" w:hAnsi="Symbol" w:hint="default"/>
+      </w:rPr>
+    </w:lvl>
+    <w:lvl w:ilvl="4" w:tplc="100A0003" w:tentative="1">
+      <w:start w:val="1"/>
+      <w:numFmt w:val="bullet"/>
+      <w:lvlText w:val="o"/>
+      <w:lvlJc w:val="left"/>
+      <w:pPr>
+        <w:ind w:left="3600" w:hanging="360"/>
+      </w:pPr>
+      <w:rPr>
+        <w:rFonts w:ascii="Courier New" w:hAnsi="Courier New" w:cs="Courier New" w:hint="default"/>
+      </w:rPr>
+    </w:lvl>
+    <w:lvl w:ilvl="5" w:tplc="100A0005" w:tentative="1">
+      <w:start w:val="1"/>
+      <w:numFmt w:val="bullet"/>
+      <w:lvlText w:val=""/>
+      <w:lvlJc w:val="left"/>
+      <w:pPr>
+        <w:ind w:left="4320" w:hanging="360"/>
+      </w:pPr>
+      <w:rPr>
+        <w:rFonts w:ascii="Wingdings" w:hAnsi="Wingdings" w:hint="default"/>
+      </w:rPr>
+    </w:lvl>
+    <w:lvl w:ilvl="6" w:tplc="100A0001" w:tentative="1">
+      <w:start w:val="1"/>
+      <w:numFmt w:val="bullet"/>
+      <w:lvlText w:val=""/>
+      <w:lvlJc w:val="left"/>
+      <w:pPr>
+        <w:ind w:left="5040" w:hanging="360"/>
+      </w:pPr>
+      <w:rPr>
+        <w:rFonts w:ascii="Symbol" w:hAnsi="Symbol" w:hint="default"/>
+      </w:rPr>
+    </w:lvl>
+    <w:lvl w:ilvl="7" w:tplc="100A0003" w:tentative="1">
+      <w:start w:val="1"/>
+      <w:numFmt w:val="bullet"/>
+      <w:lvlText w:val="o"/>
+      <w:lvlJc w:val="left"/>
+      <w:pPr>
+        <w:ind w:left="5760" w:hanging="360"/>
+      </w:pPr>
+      <w:rPr>
+        <w:rFonts w:ascii="Courier New" w:hAnsi="Courier New" w:cs="Courier New" w:hint="default"/>
+      </w:rPr>
+    </w:lvl>
+    <w:lvl w:ilvl="8" w:tplc="100A0005" w:tentative="1">
+      <w:start w:val="1"/>
+      <w:numFmt w:val="bullet"/>
+      <w:lvlText w:val=""/>
+      <w:lvlJc w:val="left"/>
+      <w:pPr>
+        <w:ind w:left="6480" w:hanging="360"/>
+      </w:pPr>
+      <w:rPr>
+        <w:rFonts w:ascii="Wingdings" w:hAnsi="Wingdings" w:hint="default"/>
+      </w:rPr>
+    </w:lvl>
+  </w:abstractNum>
+  <w:abstractNum w:abstractNumId="11" w15:restartNumberingAfterBreak="0">
+    <w:nsid w:val="48563EAD"/>
+    <w:multiLevelType w:val="multilevel"/>
+    <w:tmpl w:val="8854952A"/>
+    <w:lvl w:ilvl="0">
+      <w:start w:val="1"/>
+      <w:numFmt w:val="bullet"/>
+      <w:lvlText w:val=""/>
+      <w:lvlJc w:val="left"/>
+      <w:pPr>
+        <w:tabs>
+          <w:tab w:val="num" w:pos="720"/>
+        </w:tabs>
+        <w:ind w:left="720" w:hanging="360"/>
+      </w:pPr>
+      <w:rPr>
+        <w:rFonts w:ascii="Symbol" w:hAnsi="Symbol" w:hint="default"/>
+        <w:sz w:val="20"/>
+      </w:rPr>
+    </w:lvl>
+    <w:lvl w:ilvl="1" w:tentative="1">
+      <w:start w:val="1"/>
+      <w:numFmt w:val="bullet"/>
+      <w:lvlText w:val="o"/>
+      <w:lvlJc w:val="left"/>
+      <w:pPr>
+        <w:tabs>
+          <w:tab w:val="num" w:pos="1440"/>
+        </w:tabs>
+        <w:ind w:left="1440" w:hanging="360"/>
+      </w:pPr>
+      <w:rPr>
+        <w:rFonts w:ascii="Courier New" w:hAnsi="Courier New" w:hint="default"/>
+        <w:sz w:val="20"/>
+      </w:rPr>
+    </w:lvl>
+    <w:lvl w:ilvl="2" w:tentative="1">
+      <w:start w:val="1"/>
+      <w:numFmt w:val="bullet"/>
+      <w:lvlText w:val=""/>
+      <w:lvlJc w:val="left"/>
+      <w:pPr>
+        <w:tabs>
+          <w:tab w:val="num" w:pos="2160"/>
+        </w:tabs>
+        <w:ind w:left="2160" w:hanging="360"/>
+      </w:pPr>
+      <w:rPr>
+        <w:rFonts w:ascii="Wingdings" w:hAnsi="Wingdings" w:hint="default"/>
+        <w:sz w:val="20"/>
+      </w:rPr>
+    </w:lvl>
+    <w:lvl w:ilvl="3" w:tentative="1">
+      <w:start w:val="1"/>
+      <w:numFmt w:val="bullet"/>
+      <w:lvlText w:val=""/>
+      <w:lvlJc w:val="left"/>
+      <w:pPr>
+        <w:tabs>
+          <w:tab w:val="num" w:pos="2880"/>
+        </w:tabs>
+        <w:ind w:left="2880" w:hanging="360"/>
+      </w:pPr>
+      <w:rPr>
+        <w:rFonts w:ascii="Wingdings" w:hAnsi="Wingdings" w:hint="default"/>
+        <w:sz w:val="20"/>
+      </w:rPr>
+    </w:lvl>
+    <w:lvl w:ilvl="4" w:tentative="1">
+      <w:start w:val="1"/>
+      <w:numFmt w:val="bullet"/>
+      <w:lvlText w:val=""/>
+      <w:lvlJc w:val="left"/>
+      <w:pPr>
+        <w:tabs>
+          <w:tab w:val="num" w:pos="3600"/>
+        </w:tabs>
+        <w:ind w:left="3600" w:hanging="360"/>
+      </w:pPr>
+      <w:rPr>
+        <w:rFonts w:ascii="Wingdings" w:hAnsi="Wingdings" w:hint="default"/>
+        <w:sz w:val="20"/>
+      </w:rPr>
+    </w:lvl>
+    <w:lvl w:ilvl="5" w:tentative="1">
+      <w:start w:val="1"/>
+      <w:numFmt w:val="bullet"/>
+      <w:lvlText w:val=""/>
+      <w:lvlJc w:val="left"/>
+      <w:pPr>
+        <w:tabs>
+          <w:tab w:val="num" w:pos="4320"/>
+        </w:tabs>
+        <w:ind w:left="4320" w:hanging="360"/>
+      </w:pPr>
+      <w:rPr>
+        <w:rFonts w:ascii="Wingdings" w:hAnsi="Wingdings" w:hint="default"/>
+        <w:sz w:val="20"/>
+      </w:rPr>
+    </w:lvl>
+    <w:lvl w:ilvl="6" w:tentative="1">
+      <w:start w:val="1"/>
+      <w:numFmt w:val="bullet"/>
+      <w:lvlText w:val=""/>
+      <w:lvlJc w:val="left"/>
+      <w:pPr>
+        <w:tabs>
+          <w:tab w:val="num" w:pos="5040"/>
+        </w:tabs>
+        <w:ind w:left="5040" w:hanging="360"/>
+      </w:pPr>
+      <w:rPr>
+        <w:rFonts w:ascii="Wingdings" w:hAnsi="Wingdings" w:hint="default"/>
+        <w:sz w:val="20"/>
+      </w:rPr>
+    </w:lvl>
+    <w:lvl w:ilvl="7" w:tentative="1">
+      <w:start w:val="1"/>
+      <w:numFmt w:val="bullet"/>
+      <w:lvlText w:val=""/>
+      <w:lvlJc w:val="left"/>
+      <w:pPr>
+        <w:tabs>
+          <w:tab w:val="num" w:pos="5760"/>
+        </w:tabs>
+        <w:ind w:left="5760" w:hanging="360"/>
+      </w:pPr>
+      <w:rPr>
+        <w:rFonts w:ascii="Wingdings" w:hAnsi="Wingdings" w:hint="default"/>
+        <w:sz w:val="20"/>
+      </w:rPr>
+    </w:lvl>
+    <w:lvl w:ilvl="8" w:tentative="1">
+      <w:start w:val="1"/>
+      <w:numFmt w:val="bullet"/>
+      <w:lvlText w:val=""/>
+      <w:lvlJc w:val="left"/>
+      <w:pPr>
+        <w:tabs>
+          <w:tab w:val="num" w:pos="6480"/>
+        </w:tabs>
+        <w:ind w:left="6480" w:hanging="360"/>
+      </w:pPr>
+      <w:rPr>
+        <w:rFonts w:ascii="Wingdings" w:hAnsi="Wingdings" w:hint="default"/>
+        <w:sz w:val="20"/>
+      </w:rPr>
+    </w:lvl>
+  </w:abstractNum>
+  <w:abstractNum w:abstractNumId="12" w15:restartNumberingAfterBreak="0">
+    <w:nsid w:val="4C8B2811"/>
+    <w:multiLevelType w:val="multilevel"/>
+    <w:tmpl w:val="961A0C2C"/>
+    <w:lvl w:ilvl="0">
+      <w:start w:val="1"/>
+      <w:numFmt w:val="bullet"/>
+      <w:lvlText w:val=""/>
+      <w:lvlJc w:val="left"/>
+      <w:pPr>
+        <w:tabs>
+          <w:tab w:val="num" w:pos="720"/>
+        </w:tabs>
+        <w:ind w:left="720" w:hanging="360"/>
+      </w:pPr>
+      <w:rPr>
+        <w:rFonts w:ascii="Symbol" w:hAnsi="Symbol" w:hint="default"/>
+        <w:sz w:val="20"/>
+      </w:rPr>
+    </w:lvl>
+    <w:lvl w:ilvl="1" w:tentative="1">
+      <w:start w:val="1"/>
+      <w:numFmt w:val="bullet"/>
+      <w:lvlText w:val="o"/>
+      <w:lvlJc w:val="left"/>
+      <w:pPr>
+        <w:tabs>
+          <w:tab w:val="num" w:pos="1440"/>
+        </w:tabs>
+        <w:ind w:left="1440" w:hanging="360"/>
+      </w:pPr>
+      <w:rPr>
+        <w:rFonts w:ascii="Courier New" w:hAnsi="Courier New" w:hint="default"/>
+        <w:sz w:val="20"/>
+      </w:rPr>
+    </w:lvl>
+    <w:lvl w:ilvl="2" w:tentative="1">
+      <w:start w:val="1"/>
+      <w:numFmt w:val="bullet"/>
+      <w:lvlText w:val=""/>
+      <w:lvlJc w:val="left"/>
+      <w:pPr>
+        <w:tabs>
+          <w:tab w:val="num" w:pos="2160"/>
+        </w:tabs>
+        <w:ind w:left="2160" w:hanging="360"/>
+      </w:pPr>
+      <w:rPr>
+        <w:rFonts w:ascii="Wingdings" w:hAnsi="Wingdings" w:hint="default"/>
+        <w:sz w:val="20"/>
+      </w:rPr>
+    </w:lvl>
+    <w:lvl w:ilvl="3" w:tentative="1">
+      <w:start w:val="1"/>
+      <w:numFmt w:val="bullet"/>
+      <w:lvlText w:val=""/>
+      <w:lvlJc w:val="left"/>
+      <w:pPr>
+        <w:tabs>
+          <w:tab w:val="num" w:pos="2880"/>
+        </w:tabs>
+        <w:ind w:left="2880" w:hanging="360"/>
+      </w:pPr>
+      <w:rPr>
+        <w:rFonts w:ascii="Wingdings" w:hAnsi="Wingdings" w:hint="default"/>
+        <w:sz w:val="20"/>
+      </w:rPr>
+    </w:lvl>
+    <w:lvl w:ilvl="4" w:tentative="1">
+      <w:start w:val="1"/>
+      <w:numFmt w:val="bullet"/>
+      <w:lvlText w:val=""/>
+      <w:lvlJc w:val="left"/>
+      <w:pPr>
+        <w:tabs>
+          <w:tab w:val="num" w:pos="3600"/>
+        </w:tabs>
+        <w:ind w:left="3600" w:hanging="360"/>
+      </w:pPr>
+      <w:rPr>
+        <w:rFonts w:ascii="Wingdings" w:hAnsi="Wingdings" w:hint="default"/>
+        <w:sz w:val="20"/>
+      </w:rPr>
+    </w:lvl>
+    <w:lvl w:ilvl="5" w:tentative="1">
+      <w:start w:val="1"/>
+      <w:numFmt w:val="bullet"/>
+      <w:lvlText w:val=""/>
+      <w:lvlJc w:val="left"/>
+      <w:pPr>
+        <w:tabs>
+          <w:tab w:val="num" w:pos="4320"/>
+        </w:tabs>
+        <w:ind w:left="4320" w:hanging="360"/>
+      </w:pPr>
+      <w:rPr>
+        <w:rFonts w:ascii="Wingdings" w:hAnsi="Wingdings" w:hint="default"/>
+        <w:sz w:val="20"/>
+      </w:rPr>
+    </w:lvl>
+    <w:lvl w:ilvl="6" w:tentative="1">
+      <w:start w:val="1"/>
+      <w:numFmt w:val="bullet"/>
+      <w:lvlText w:val=""/>
+      <w:lvlJc w:val="left"/>
+      <w:pPr>
+        <w:tabs>
+          <w:tab w:val="num" w:pos="5040"/>
+        </w:tabs>
+        <w:ind w:left="5040" w:hanging="360"/>
+      </w:pPr>
+      <w:rPr>
+        <w:rFonts w:ascii="Wingdings" w:hAnsi="Wingdings" w:hint="default"/>
+        <w:sz w:val="20"/>
+      </w:rPr>
+    </w:lvl>
+    <w:lvl w:ilvl="7" w:tentative="1">
+      <w:start w:val="1"/>
+      <w:numFmt w:val="bullet"/>
+      <w:lvlText w:val=""/>
+      <w:lvlJc w:val="left"/>
+      <w:pPr>
+        <w:tabs>
+          <w:tab w:val="num" w:pos="5760"/>
+        </w:tabs>
+        <w:ind w:left="5760" w:hanging="360"/>
+      </w:pPr>
+      <w:rPr>
+        <w:rFonts w:ascii="Wingdings" w:hAnsi="Wingdings" w:hint="default"/>
+        <w:sz w:val="20"/>
+      </w:rPr>
+    </w:lvl>
+    <w:lvl w:ilvl="8" w:tentative="1">
+      <w:start w:val="1"/>
+      <w:numFmt w:val="bullet"/>
+      <w:lvlText w:val=""/>
+      <w:lvlJc w:val="left"/>
+      <w:pPr>
+        <w:tabs>
+          <w:tab w:val="num" w:pos="6480"/>
+        </w:tabs>
+        <w:ind w:left="6480" w:hanging="360"/>
+      </w:pPr>
+      <w:rPr>
+        <w:rFonts w:ascii="Wingdings" w:hAnsi="Wingdings" w:hint="default"/>
+        <w:sz w:val="20"/>
+      </w:rPr>
+    </w:lvl>
+  </w:abstractNum>
+  <w:abstractNum w:abstractNumId="13" w15:restartNumberingAfterBreak="0">
     <w:nsid w:val="4D8C349E"/>
     <w:multiLevelType w:val="hybridMultilevel"/>
     <w:tmpl w:val="5F78059E"/>
@@ -6549,8 +9359,1074 @@
       </w:rPr>
     </w:lvl>
   </w:abstractNum>
+  <w:abstractNum w:abstractNumId="14" w15:restartNumberingAfterBreak="0">
+    <w:nsid w:val="567C0D86"/>
+    <w:multiLevelType w:val="multilevel"/>
+    <w:tmpl w:val="16C25D56"/>
+    <w:lvl w:ilvl="0">
+      <w:start w:val="1"/>
+      <w:numFmt w:val="bullet"/>
+      <w:lvlText w:val=""/>
+      <w:lvlJc w:val="left"/>
+      <w:pPr>
+        <w:tabs>
+          <w:tab w:val="num" w:pos="720"/>
+        </w:tabs>
+        <w:ind w:left="720" w:hanging="360"/>
+      </w:pPr>
+      <w:rPr>
+        <w:rFonts w:ascii="Symbol" w:hAnsi="Symbol" w:hint="default"/>
+        <w:sz w:val="20"/>
+      </w:rPr>
+    </w:lvl>
+    <w:lvl w:ilvl="1" w:tentative="1">
+      <w:start w:val="1"/>
+      <w:numFmt w:val="bullet"/>
+      <w:lvlText w:val="o"/>
+      <w:lvlJc w:val="left"/>
+      <w:pPr>
+        <w:tabs>
+          <w:tab w:val="num" w:pos="1440"/>
+        </w:tabs>
+        <w:ind w:left="1440" w:hanging="360"/>
+      </w:pPr>
+      <w:rPr>
+        <w:rFonts w:ascii="Courier New" w:hAnsi="Courier New" w:hint="default"/>
+        <w:sz w:val="20"/>
+      </w:rPr>
+    </w:lvl>
+    <w:lvl w:ilvl="2" w:tentative="1">
+      <w:start w:val="1"/>
+      <w:numFmt w:val="bullet"/>
+      <w:lvlText w:val=""/>
+      <w:lvlJc w:val="left"/>
+      <w:pPr>
+        <w:tabs>
+          <w:tab w:val="num" w:pos="2160"/>
+        </w:tabs>
+        <w:ind w:left="2160" w:hanging="360"/>
+      </w:pPr>
+      <w:rPr>
+        <w:rFonts w:ascii="Wingdings" w:hAnsi="Wingdings" w:hint="default"/>
+        <w:sz w:val="20"/>
+      </w:rPr>
+    </w:lvl>
+    <w:lvl w:ilvl="3" w:tentative="1">
+      <w:start w:val="1"/>
+      <w:numFmt w:val="bullet"/>
+      <w:lvlText w:val=""/>
+      <w:lvlJc w:val="left"/>
+      <w:pPr>
+        <w:tabs>
+          <w:tab w:val="num" w:pos="2880"/>
+        </w:tabs>
+        <w:ind w:left="2880" w:hanging="360"/>
+      </w:pPr>
+      <w:rPr>
+        <w:rFonts w:ascii="Wingdings" w:hAnsi="Wingdings" w:hint="default"/>
+        <w:sz w:val="20"/>
+      </w:rPr>
+    </w:lvl>
+    <w:lvl w:ilvl="4" w:tentative="1">
+      <w:start w:val="1"/>
+      <w:numFmt w:val="bullet"/>
+      <w:lvlText w:val=""/>
+      <w:lvlJc w:val="left"/>
+      <w:pPr>
+        <w:tabs>
+          <w:tab w:val="num" w:pos="3600"/>
+        </w:tabs>
+        <w:ind w:left="3600" w:hanging="360"/>
+      </w:pPr>
+      <w:rPr>
+        <w:rFonts w:ascii="Wingdings" w:hAnsi="Wingdings" w:hint="default"/>
+        <w:sz w:val="20"/>
+      </w:rPr>
+    </w:lvl>
+    <w:lvl w:ilvl="5" w:tentative="1">
+      <w:start w:val="1"/>
+      <w:numFmt w:val="bullet"/>
+      <w:lvlText w:val=""/>
+      <w:lvlJc w:val="left"/>
+      <w:pPr>
+        <w:tabs>
+          <w:tab w:val="num" w:pos="4320"/>
+        </w:tabs>
+        <w:ind w:left="4320" w:hanging="360"/>
+      </w:pPr>
+      <w:rPr>
+        <w:rFonts w:ascii="Wingdings" w:hAnsi="Wingdings" w:hint="default"/>
+        <w:sz w:val="20"/>
+      </w:rPr>
+    </w:lvl>
+    <w:lvl w:ilvl="6" w:tentative="1">
+      <w:start w:val="1"/>
+      <w:numFmt w:val="bullet"/>
+      <w:lvlText w:val=""/>
+      <w:lvlJc w:val="left"/>
+      <w:pPr>
+        <w:tabs>
+          <w:tab w:val="num" w:pos="5040"/>
+        </w:tabs>
+        <w:ind w:left="5040" w:hanging="360"/>
+      </w:pPr>
+      <w:rPr>
+        <w:rFonts w:ascii="Wingdings" w:hAnsi="Wingdings" w:hint="default"/>
+        <w:sz w:val="20"/>
+      </w:rPr>
+    </w:lvl>
+    <w:lvl w:ilvl="7" w:tentative="1">
+      <w:start w:val="1"/>
+      <w:numFmt w:val="bullet"/>
+      <w:lvlText w:val=""/>
+      <w:lvlJc w:val="left"/>
+      <w:pPr>
+        <w:tabs>
+          <w:tab w:val="num" w:pos="5760"/>
+        </w:tabs>
+        <w:ind w:left="5760" w:hanging="360"/>
+      </w:pPr>
+      <w:rPr>
+        <w:rFonts w:ascii="Wingdings" w:hAnsi="Wingdings" w:hint="default"/>
+        <w:sz w:val="20"/>
+      </w:rPr>
+    </w:lvl>
+    <w:lvl w:ilvl="8" w:tentative="1">
+      <w:start w:val="1"/>
+      <w:numFmt w:val="bullet"/>
+      <w:lvlText w:val=""/>
+      <w:lvlJc w:val="left"/>
+      <w:pPr>
+        <w:tabs>
+          <w:tab w:val="num" w:pos="6480"/>
+        </w:tabs>
+        <w:ind w:left="6480" w:hanging="360"/>
+      </w:pPr>
+      <w:rPr>
+        <w:rFonts w:ascii="Wingdings" w:hAnsi="Wingdings" w:hint="default"/>
+        <w:sz w:val="20"/>
+      </w:rPr>
+    </w:lvl>
+  </w:abstractNum>
+  <w:abstractNum w:abstractNumId="15" w15:restartNumberingAfterBreak="0">
+    <w:nsid w:val="58753C94"/>
+    <w:multiLevelType w:val="hybridMultilevel"/>
+    <w:tmpl w:val="74F20A18"/>
+    <w:lvl w:ilvl="0" w:tplc="F09E7F62">
+      <w:numFmt w:val="bullet"/>
+      <w:lvlText w:val="-"/>
+      <w:lvlJc w:val="left"/>
+      <w:pPr>
+        <w:ind w:left="720" w:hanging="360"/>
+      </w:pPr>
+      <w:rPr>
+        <w:rFonts w:ascii="Aptos" w:eastAsiaTheme="minorHAnsi" w:hAnsi="Aptos" w:cstheme="minorBidi" w:hint="default"/>
+      </w:rPr>
+    </w:lvl>
+    <w:lvl w:ilvl="1" w:tplc="100A0003" w:tentative="1">
+      <w:start w:val="1"/>
+      <w:numFmt w:val="bullet"/>
+      <w:lvlText w:val="o"/>
+      <w:lvlJc w:val="left"/>
+      <w:pPr>
+        <w:ind w:left="1440" w:hanging="360"/>
+      </w:pPr>
+      <w:rPr>
+        <w:rFonts w:ascii="Courier New" w:hAnsi="Courier New" w:cs="Courier New" w:hint="default"/>
+      </w:rPr>
+    </w:lvl>
+    <w:lvl w:ilvl="2" w:tplc="100A0005" w:tentative="1">
+      <w:start w:val="1"/>
+      <w:numFmt w:val="bullet"/>
+      <w:lvlText w:val=""/>
+      <w:lvlJc w:val="left"/>
+      <w:pPr>
+        <w:ind w:left="2160" w:hanging="360"/>
+      </w:pPr>
+      <w:rPr>
+        <w:rFonts w:ascii="Wingdings" w:hAnsi="Wingdings" w:hint="default"/>
+      </w:rPr>
+    </w:lvl>
+    <w:lvl w:ilvl="3" w:tplc="100A0001" w:tentative="1">
+      <w:start w:val="1"/>
+      <w:numFmt w:val="bullet"/>
+      <w:lvlText w:val=""/>
+      <w:lvlJc w:val="left"/>
+      <w:pPr>
+        <w:ind w:left="2880" w:hanging="360"/>
+      </w:pPr>
+      <w:rPr>
+        <w:rFonts w:ascii="Symbol" w:hAnsi="Symbol" w:hint="default"/>
+      </w:rPr>
+    </w:lvl>
+    <w:lvl w:ilvl="4" w:tplc="100A0003" w:tentative="1">
+      <w:start w:val="1"/>
+      <w:numFmt w:val="bullet"/>
+      <w:lvlText w:val="o"/>
+      <w:lvlJc w:val="left"/>
+      <w:pPr>
+        <w:ind w:left="3600" w:hanging="360"/>
+      </w:pPr>
+      <w:rPr>
+        <w:rFonts w:ascii="Courier New" w:hAnsi="Courier New" w:cs="Courier New" w:hint="default"/>
+      </w:rPr>
+    </w:lvl>
+    <w:lvl w:ilvl="5" w:tplc="100A0005" w:tentative="1">
+      <w:start w:val="1"/>
+      <w:numFmt w:val="bullet"/>
+      <w:lvlText w:val=""/>
+      <w:lvlJc w:val="left"/>
+      <w:pPr>
+        <w:ind w:left="4320" w:hanging="360"/>
+      </w:pPr>
+      <w:rPr>
+        <w:rFonts w:ascii="Wingdings" w:hAnsi="Wingdings" w:hint="default"/>
+      </w:rPr>
+    </w:lvl>
+    <w:lvl w:ilvl="6" w:tplc="100A0001" w:tentative="1">
+      <w:start w:val="1"/>
+      <w:numFmt w:val="bullet"/>
+      <w:lvlText w:val=""/>
+      <w:lvlJc w:val="left"/>
+      <w:pPr>
+        <w:ind w:left="5040" w:hanging="360"/>
+      </w:pPr>
+      <w:rPr>
+        <w:rFonts w:ascii="Symbol" w:hAnsi="Symbol" w:hint="default"/>
+      </w:rPr>
+    </w:lvl>
+    <w:lvl w:ilvl="7" w:tplc="100A0003" w:tentative="1">
+      <w:start w:val="1"/>
+      <w:numFmt w:val="bullet"/>
+      <w:lvlText w:val="o"/>
+      <w:lvlJc w:val="left"/>
+      <w:pPr>
+        <w:ind w:left="5760" w:hanging="360"/>
+      </w:pPr>
+      <w:rPr>
+        <w:rFonts w:ascii="Courier New" w:hAnsi="Courier New" w:cs="Courier New" w:hint="default"/>
+      </w:rPr>
+    </w:lvl>
+    <w:lvl w:ilvl="8" w:tplc="100A0005" w:tentative="1">
+      <w:start w:val="1"/>
+      <w:numFmt w:val="bullet"/>
+      <w:lvlText w:val=""/>
+      <w:lvlJc w:val="left"/>
+      <w:pPr>
+        <w:ind w:left="6480" w:hanging="360"/>
+      </w:pPr>
+      <w:rPr>
+        <w:rFonts w:ascii="Wingdings" w:hAnsi="Wingdings" w:hint="default"/>
+      </w:rPr>
+    </w:lvl>
+  </w:abstractNum>
+  <w:abstractNum w:abstractNumId="16" w15:restartNumberingAfterBreak="0">
+    <w:nsid w:val="5B90648C"/>
+    <w:multiLevelType w:val="multilevel"/>
+    <w:tmpl w:val="2A820B00"/>
+    <w:lvl w:ilvl="0">
+      <w:start w:val="1"/>
+      <w:numFmt w:val="bullet"/>
+      <w:lvlText w:val=""/>
+      <w:lvlJc w:val="left"/>
+      <w:pPr>
+        <w:tabs>
+          <w:tab w:val="num" w:pos="720"/>
+        </w:tabs>
+        <w:ind w:left="720" w:hanging="360"/>
+      </w:pPr>
+      <w:rPr>
+        <w:rFonts w:ascii="Symbol" w:hAnsi="Symbol" w:hint="default"/>
+        <w:sz w:val="20"/>
+      </w:rPr>
+    </w:lvl>
+    <w:lvl w:ilvl="1" w:tentative="1">
+      <w:start w:val="1"/>
+      <w:numFmt w:val="bullet"/>
+      <w:lvlText w:val="o"/>
+      <w:lvlJc w:val="left"/>
+      <w:pPr>
+        <w:tabs>
+          <w:tab w:val="num" w:pos="1440"/>
+        </w:tabs>
+        <w:ind w:left="1440" w:hanging="360"/>
+      </w:pPr>
+      <w:rPr>
+        <w:rFonts w:ascii="Courier New" w:hAnsi="Courier New" w:hint="default"/>
+        <w:sz w:val="20"/>
+      </w:rPr>
+    </w:lvl>
+    <w:lvl w:ilvl="2" w:tentative="1">
+      <w:start w:val="1"/>
+      <w:numFmt w:val="bullet"/>
+      <w:lvlText w:val=""/>
+      <w:lvlJc w:val="left"/>
+      <w:pPr>
+        <w:tabs>
+          <w:tab w:val="num" w:pos="2160"/>
+        </w:tabs>
+        <w:ind w:left="2160" w:hanging="360"/>
+      </w:pPr>
+      <w:rPr>
+        <w:rFonts w:ascii="Wingdings" w:hAnsi="Wingdings" w:hint="default"/>
+        <w:sz w:val="20"/>
+      </w:rPr>
+    </w:lvl>
+    <w:lvl w:ilvl="3" w:tentative="1">
+      <w:start w:val="1"/>
+      <w:numFmt w:val="bullet"/>
+      <w:lvlText w:val=""/>
+      <w:lvlJc w:val="left"/>
+      <w:pPr>
+        <w:tabs>
+          <w:tab w:val="num" w:pos="2880"/>
+        </w:tabs>
+        <w:ind w:left="2880" w:hanging="360"/>
+      </w:pPr>
+      <w:rPr>
+        <w:rFonts w:ascii="Wingdings" w:hAnsi="Wingdings" w:hint="default"/>
+        <w:sz w:val="20"/>
+      </w:rPr>
+    </w:lvl>
+    <w:lvl w:ilvl="4" w:tentative="1">
+      <w:start w:val="1"/>
+      <w:numFmt w:val="bullet"/>
+      <w:lvlText w:val=""/>
+      <w:lvlJc w:val="left"/>
+      <w:pPr>
+        <w:tabs>
+          <w:tab w:val="num" w:pos="3600"/>
+        </w:tabs>
+        <w:ind w:left="3600" w:hanging="360"/>
+      </w:pPr>
+      <w:rPr>
+        <w:rFonts w:ascii="Wingdings" w:hAnsi="Wingdings" w:hint="default"/>
+        <w:sz w:val="20"/>
+      </w:rPr>
+    </w:lvl>
+    <w:lvl w:ilvl="5" w:tentative="1">
+      <w:start w:val="1"/>
+      <w:numFmt w:val="bullet"/>
+      <w:lvlText w:val=""/>
+      <w:lvlJc w:val="left"/>
+      <w:pPr>
+        <w:tabs>
+          <w:tab w:val="num" w:pos="4320"/>
+        </w:tabs>
+        <w:ind w:left="4320" w:hanging="360"/>
+      </w:pPr>
+      <w:rPr>
+        <w:rFonts w:ascii="Wingdings" w:hAnsi="Wingdings" w:hint="default"/>
+        <w:sz w:val="20"/>
+      </w:rPr>
+    </w:lvl>
+    <w:lvl w:ilvl="6" w:tentative="1">
+      <w:start w:val="1"/>
+      <w:numFmt w:val="bullet"/>
+      <w:lvlText w:val=""/>
+      <w:lvlJc w:val="left"/>
+      <w:pPr>
+        <w:tabs>
+          <w:tab w:val="num" w:pos="5040"/>
+        </w:tabs>
+        <w:ind w:left="5040" w:hanging="360"/>
+      </w:pPr>
+      <w:rPr>
+        <w:rFonts w:ascii="Wingdings" w:hAnsi="Wingdings" w:hint="default"/>
+        <w:sz w:val="20"/>
+      </w:rPr>
+    </w:lvl>
+    <w:lvl w:ilvl="7" w:tentative="1">
+      <w:start w:val="1"/>
+      <w:numFmt w:val="bullet"/>
+      <w:lvlText w:val=""/>
+      <w:lvlJc w:val="left"/>
+      <w:pPr>
+        <w:tabs>
+          <w:tab w:val="num" w:pos="5760"/>
+        </w:tabs>
+        <w:ind w:left="5760" w:hanging="360"/>
+      </w:pPr>
+      <w:rPr>
+        <w:rFonts w:ascii="Wingdings" w:hAnsi="Wingdings" w:hint="default"/>
+        <w:sz w:val="20"/>
+      </w:rPr>
+    </w:lvl>
+    <w:lvl w:ilvl="8" w:tentative="1">
+      <w:start w:val="1"/>
+      <w:numFmt w:val="bullet"/>
+      <w:lvlText w:val=""/>
+      <w:lvlJc w:val="left"/>
+      <w:pPr>
+        <w:tabs>
+          <w:tab w:val="num" w:pos="6480"/>
+        </w:tabs>
+        <w:ind w:left="6480" w:hanging="360"/>
+      </w:pPr>
+      <w:rPr>
+        <w:rFonts w:ascii="Wingdings" w:hAnsi="Wingdings" w:hint="default"/>
+        <w:sz w:val="20"/>
+      </w:rPr>
+    </w:lvl>
+  </w:abstractNum>
+  <w:abstractNum w:abstractNumId="17" w15:restartNumberingAfterBreak="0">
+    <w:nsid w:val="6DFB7391"/>
+    <w:multiLevelType w:val="multilevel"/>
+    <w:tmpl w:val="9FE0E394"/>
+    <w:lvl w:ilvl="0">
+      <w:start w:val="1"/>
+      <w:numFmt w:val="bullet"/>
+      <w:lvlText w:val=""/>
+      <w:lvlJc w:val="left"/>
+      <w:pPr>
+        <w:tabs>
+          <w:tab w:val="num" w:pos="720"/>
+        </w:tabs>
+        <w:ind w:left="720" w:hanging="360"/>
+      </w:pPr>
+      <w:rPr>
+        <w:rFonts w:ascii="Symbol" w:hAnsi="Symbol" w:hint="default"/>
+        <w:sz w:val="20"/>
+      </w:rPr>
+    </w:lvl>
+    <w:lvl w:ilvl="1" w:tentative="1">
+      <w:start w:val="1"/>
+      <w:numFmt w:val="bullet"/>
+      <w:lvlText w:val="o"/>
+      <w:lvlJc w:val="left"/>
+      <w:pPr>
+        <w:tabs>
+          <w:tab w:val="num" w:pos="1440"/>
+        </w:tabs>
+        <w:ind w:left="1440" w:hanging="360"/>
+      </w:pPr>
+      <w:rPr>
+        <w:rFonts w:ascii="Courier New" w:hAnsi="Courier New" w:hint="default"/>
+        <w:sz w:val="20"/>
+      </w:rPr>
+    </w:lvl>
+    <w:lvl w:ilvl="2" w:tentative="1">
+      <w:start w:val="1"/>
+      <w:numFmt w:val="bullet"/>
+      <w:lvlText w:val=""/>
+      <w:lvlJc w:val="left"/>
+      <w:pPr>
+        <w:tabs>
+          <w:tab w:val="num" w:pos="2160"/>
+        </w:tabs>
+        <w:ind w:left="2160" w:hanging="360"/>
+      </w:pPr>
+      <w:rPr>
+        <w:rFonts w:ascii="Wingdings" w:hAnsi="Wingdings" w:hint="default"/>
+        <w:sz w:val="20"/>
+      </w:rPr>
+    </w:lvl>
+    <w:lvl w:ilvl="3" w:tentative="1">
+      <w:start w:val="1"/>
+      <w:numFmt w:val="bullet"/>
+      <w:lvlText w:val=""/>
+      <w:lvlJc w:val="left"/>
+      <w:pPr>
+        <w:tabs>
+          <w:tab w:val="num" w:pos="2880"/>
+        </w:tabs>
+        <w:ind w:left="2880" w:hanging="360"/>
+      </w:pPr>
+      <w:rPr>
+        <w:rFonts w:ascii="Wingdings" w:hAnsi="Wingdings" w:hint="default"/>
+        <w:sz w:val="20"/>
+      </w:rPr>
+    </w:lvl>
+    <w:lvl w:ilvl="4" w:tentative="1">
+      <w:start w:val="1"/>
+      <w:numFmt w:val="bullet"/>
+      <w:lvlText w:val=""/>
+      <w:lvlJc w:val="left"/>
+      <w:pPr>
+        <w:tabs>
+          <w:tab w:val="num" w:pos="3600"/>
+        </w:tabs>
+        <w:ind w:left="3600" w:hanging="360"/>
+      </w:pPr>
+      <w:rPr>
+        <w:rFonts w:ascii="Wingdings" w:hAnsi="Wingdings" w:hint="default"/>
+        <w:sz w:val="20"/>
+      </w:rPr>
+    </w:lvl>
+    <w:lvl w:ilvl="5" w:tentative="1">
+      <w:start w:val="1"/>
+      <w:numFmt w:val="bullet"/>
+      <w:lvlText w:val=""/>
+      <w:lvlJc w:val="left"/>
+      <w:pPr>
+        <w:tabs>
+          <w:tab w:val="num" w:pos="4320"/>
+        </w:tabs>
+        <w:ind w:left="4320" w:hanging="360"/>
+      </w:pPr>
+      <w:rPr>
+        <w:rFonts w:ascii="Wingdings" w:hAnsi="Wingdings" w:hint="default"/>
+        <w:sz w:val="20"/>
+      </w:rPr>
+    </w:lvl>
+    <w:lvl w:ilvl="6" w:tentative="1">
+      <w:start w:val="1"/>
+      <w:numFmt w:val="bullet"/>
+      <w:lvlText w:val=""/>
+      <w:lvlJc w:val="left"/>
+      <w:pPr>
+        <w:tabs>
+          <w:tab w:val="num" w:pos="5040"/>
+        </w:tabs>
+        <w:ind w:left="5040" w:hanging="360"/>
+      </w:pPr>
+      <w:rPr>
+        <w:rFonts w:ascii="Wingdings" w:hAnsi="Wingdings" w:hint="default"/>
+        <w:sz w:val="20"/>
+      </w:rPr>
+    </w:lvl>
+    <w:lvl w:ilvl="7" w:tentative="1">
+      <w:start w:val="1"/>
+      <w:numFmt w:val="bullet"/>
+      <w:lvlText w:val=""/>
+      <w:lvlJc w:val="left"/>
+      <w:pPr>
+        <w:tabs>
+          <w:tab w:val="num" w:pos="5760"/>
+        </w:tabs>
+        <w:ind w:left="5760" w:hanging="360"/>
+      </w:pPr>
+      <w:rPr>
+        <w:rFonts w:ascii="Wingdings" w:hAnsi="Wingdings" w:hint="default"/>
+        <w:sz w:val="20"/>
+      </w:rPr>
+    </w:lvl>
+    <w:lvl w:ilvl="8" w:tentative="1">
+      <w:start w:val="1"/>
+      <w:numFmt w:val="bullet"/>
+      <w:lvlText w:val=""/>
+      <w:lvlJc w:val="left"/>
+      <w:pPr>
+        <w:tabs>
+          <w:tab w:val="num" w:pos="6480"/>
+        </w:tabs>
+        <w:ind w:left="6480" w:hanging="360"/>
+      </w:pPr>
+      <w:rPr>
+        <w:rFonts w:ascii="Wingdings" w:hAnsi="Wingdings" w:hint="default"/>
+        <w:sz w:val="20"/>
+      </w:rPr>
+    </w:lvl>
+  </w:abstractNum>
+  <w:abstractNum w:abstractNumId="18" w15:restartNumberingAfterBreak="0">
+    <w:nsid w:val="6E4170E4"/>
+    <w:multiLevelType w:val="multilevel"/>
+    <w:tmpl w:val="3B70B2CE"/>
+    <w:lvl w:ilvl="0">
+      <w:start w:val="1"/>
+      <w:numFmt w:val="bullet"/>
+      <w:lvlText w:val=""/>
+      <w:lvlJc w:val="left"/>
+      <w:pPr>
+        <w:tabs>
+          <w:tab w:val="num" w:pos="720"/>
+        </w:tabs>
+        <w:ind w:left="720" w:hanging="360"/>
+      </w:pPr>
+      <w:rPr>
+        <w:rFonts w:ascii="Symbol" w:hAnsi="Symbol" w:hint="default"/>
+        <w:sz w:val="20"/>
+      </w:rPr>
+    </w:lvl>
+    <w:lvl w:ilvl="1" w:tentative="1">
+      <w:start w:val="1"/>
+      <w:numFmt w:val="bullet"/>
+      <w:lvlText w:val="o"/>
+      <w:lvlJc w:val="left"/>
+      <w:pPr>
+        <w:tabs>
+          <w:tab w:val="num" w:pos="1440"/>
+        </w:tabs>
+        <w:ind w:left="1440" w:hanging="360"/>
+      </w:pPr>
+      <w:rPr>
+        <w:rFonts w:ascii="Courier New" w:hAnsi="Courier New" w:hint="default"/>
+        <w:sz w:val="20"/>
+      </w:rPr>
+    </w:lvl>
+    <w:lvl w:ilvl="2" w:tentative="1">
+      <w:start w:val="1"/>
+      <w:numFmt w:val="bullet"/>
+      <w:lvlText w:val=""/>
+      <w:lvlJc w:val="left"/>
+      <w:pPr>
+        <w:tabs>
+          <w:tab w:val="num" w:pos="2160"/>
+        </w:tabs>
+        <w:ind w:left="2160" w:hanging="360"/>
+      </w:pPr>
+      <w:rPr>
+        <w:rFonts w:ascii="Wingdings" w:hAnsi="Wingdings" w:hint="default"/>
+        <w:sz w:val="20"/>
+      </w:rPr>
+    </w:lvl>
+    <w:lvl w:ilvl="3" w:tentative="1">
+      <w:start w:val="1"/>
+      <w:numFmt w:val="bullet"/>
+      <w:lvlText w:val=""/>
+      <w:lvlJc w:val="left"/>
+      <w:pPr>
+        <w:tabs>
+          <w:tab w:val="num" w:pos="2880"/>
+        </w:tabs>
+        <w:ind w:left="2880" w:hanging="360"/>
+      </w:pPr>
+      <w:rPr>
+        <w:rFonts w:ascii="Wingdings" w:hAnsi="Wingdings" w:hint="default"/>
+        <w:sz w:val="20"/>
+      </w:rPr>
+    </w:lvl>
+    <w:lvl w:ilvl="4" w:tentative="1">
+      <w:start w:val="1"/>
+      <w:numFmt w:val="bullet"/>
+      <w:lvlText w:val=""/>
+      <w:lvlJc w:val="left"/>
+      <w:pPr>
+        <w:tabs>
+          <w:tab w:val="num" w:pos="3600"/>
+        </w:tabs>
+        <w:ind w:left="3600" w:hanging="360"/>
+      </w:pPr>
+      <w:rPr>
+        <w:rFonts w:ascii="Wingdings" w:hAnsi="Wingdings" w:hint="default"/>
+        <w:sz w:val="20"/>
+      </w:rPr>
+    </w:lvl>
+    <w:lvl w:ilvl="5" w:tentative="1">
+      <w:start w:val="1"/>
+      <w:numFmt w:val="bullet"/>
+      <w:lvlText w:val=""/>
+      <w:lvlJc w:val="left"/>
+      <w:pPr>
+        <w:tabs>
+          <w:tab w:val="num" w:pos="4320"/>
+        </w:tabs>
+        <w:ind w:left="4320" w:hanging="360"/>
+      </w:pPr>
+      <w:rPr>
+        <w:rFonts w:ascii="Wingdings" w:hAnsi="Wingdings" w:hint="default"/>
+        <w:sz w:val="20"/>
+      </w:rPr>
+    </w:lvl>
+    <w:lvl w:ilvl="6" w:tentative="1">
+      <w:start w:val="1"/>
+      <w:numFmt w:val="bullet"/>
+      <w:lvlText w:val=""/>
+      <w:lvlJc w:val="left"/>
+      <w:pPr>
+        <w:tabs>
+          <w:tab w:val="num" w:pos="5040"/>
+        </w:tabs>
+        <w:ind w:left="5040" w:hanging="360"/>
+      </w:pPr>
+      <w:rPr>
+        <w:rFonts w:ascii="Wingdings" w:hAnsi="Wingdings" w:hint="default"/>
+        <w:sz w:val="20"/>
+      </w:rPr>
+    </w:lvl>
+    <w:lvl w:ilvl="7" w:tentative="1">
+      <w:start w:val="1"/>
+      <w:numFmt w:val="bullet"/>
+      <w:lvlText w:val=""/>
+      <w:lvlJc w:val="left"/>
+      <w:pPr>
+        <w:tabs>
+          <w:tab w:val="num" w:pos="5760"/>
+        </w:tabs>
+        <w:ind w:left="5760" w:hanging="360"/>
+      </w:pPr>
+      <w:rPr>
+        <w:rFonts w:ascii="Wingdings" w:hAnsi="Wingdings" w:hint="default"/>
+        <w:sz w:val="20"/>
+      </w:rPr>
+    </w:lvl>
+    <w:lvl w:ilvl="8" w:tentative="1">
+      <w:start w:val="1"/>
+      <w:numFmt w:val="bullet"/>
+      <w:lvlText w:val=""/>
+      <w:lvlJc w:val="left"/>
+      <w:pPr>
+        <w:tabs>
+          <w:tab w:val="num" w:pos="6480"/>
+        </w:tabs>
+        <w:ind w:left="6480" w:hanging="360"/>
+      </w:pPr>
+      <w:rPr>
+        <w:rFonts w:ascii="Wingdings" w:hAnsi="Wingdings" w:hint="default"/>
+        <w:sz w:val="20"/>
+      </w:rPr>
+    </w:lvl>
+  </w:abstractNum>
+  <w:abstractNum w:abstractNumId="19" w15:restartNumberingAfterBreak="0">
+    <w:nsid w:val="72630109"/>
+    <w:multiLevelType w:val="multilevel"/>
+    <w:tmpl w:val="C3E6F7EA"/>
+    <w:lvl w:ilvl="0">
+      <w:start w:val="1"/>
+      <w:numFmt w:val="bullet"/>
+      <w:lvlText w:val=""/>
+      <w:lvlJc w:val="left"/>
+      <w:pPr>
+        <w:tabs>
+          <w:tab w:val="num" w:pos="720"/>
+        </w:tabs>
+        <w:ind w:left="720" w:hanging="360"/>
+      </w:pPr>
+      <w:rPr>
+        <w:rFonts w:ascii="Symbol" w:hAnsi="Symbol" w:hint="default"/>
+        <w:sz w:val="20"/>
+      </w:rPr>
+    </w:lvl>
+    <w:lvl w:ilvl="1" w:tentative="1">
+      <w:start w:val="1"/>
+      <w:numFmt w:val="bullet"/>
+      <w:lvlText w:val="o"/>
+      <w:lvlJc w:val="left"/>
+      <w:pPr>
+        <w:tabs>
+          <w:tab w:val="num" w:pos="1440"/>
+        </w:tabs>
+        <w:ind w:left="1440" w:hanging="360"/>
+      </w:pPr>
+      <w:rPr>
+        <w:rFonts w:ascii="Courier New" w:hAnsi="Courier New" w:hint="default"/>
+        <w:sz w:val="20"/>
+      </w:rPr>
+    </w:lvl>
+    <w:lvl w:ilvl="2" w:tentative="1">
+      <w:start w:val="1"/>
+      <w:numFmt w:val="bullet"/>
+      <w:lvlText w:val=""/>
+      <w:lvlJc w:val="left"/>
+      <w:pPr>
+        <w:tabs>
+          <w:tab w:val="num" w:pos="2160"/>
+        </w:tabs>
+        <w:ind w:left="2160" w:hanging="360"/>
+      </w:pPr>
+      <w:rPr>
+        <w:rFonts w:ascii="Wingdings" w:hAnsi="Wingdings" w:hint="default"/>
+        <w:sz w:val="20"/>
+      </w:rPr>
+    </w:lvl>
+    <w:lvl w:ilvl="3" w:tentative="1">
+      <w:start w:val="1"/>
+      <w:numFmt w:val="bullet"/>
+      <w:lvlText w:val=""/>
+      <w:lvlJc w:val="left"/>
+      <w:pPr>
+        <w:tabs>
+          <w:tab w:val="num" w:pos="2880"/>
+        </w:tabs>
+        <w:ind w:left="2880" w:hanging="360"/>
+      </w:pPr>
+      <w:rPr>
+        <w:rFonts w:ascii="Wingdings" w:hAnsi="Wingdings" w:hint="default"/>
+        <w:sz w:val="20"/>
+      </w:rPr>
+    </w:lvl>
+    <w:lvl w:ilvl="4" w:tentative="1">
+      <w:start w:val="1"/>
+      <w:numFmt w:val="bullet"/>
+      <w:lvlText w:val=""/>
+      <w:lvlJc w:val="left"/>
+      <w:pPr>
+        <w:tabs>
+          <w:tab w:val="num" w:pos="3600"/>
+        </w:tabs>
+        <w:ind w:left="3600" w:hanging="360"/>
+      </w:pPr>
+      <w:rPr>
+        <w:rFonts w:ascii="Wingdings" w:hAnsi="Wingdings" w:hint="default"/>
+        <w:sz w:val="20"/>
+      </w:rPr>
+    </w:lvl>
+    <w:lvl w:ilvl="5" w:tentative="1">
+      <w:start w:val="1"/>
+      <w:numFmt w:val="bullet"/>
+      <w:lvlText w:val=""/>
+      <w:lvlJc w:val="left"/>
+      <w:pPr>
+        <w:tabs>
+          <w:tab w:val="num" w:pos="4320"/>
+        </w:tabs>
+        <w:ind w:left="4320" w:hanging="360"/>
+      </w:pPr>
+      <w:rPr>
+        <w:rFonts w:ascii="Wingdings" w:hAnsi="Wingdings" w:hint="default"/>
+        <w:sz w:val="20"/>
+      </w:rPr>
+    </w:lvl>
+    <w:lvl w:ilvl="6" w:tentative="1">
+      <w:start w:val="1"/>
+      <w:numFmt w:val="bullet"/>
+      <w:lvlText w:val=""/>
+      <w:lvlJc w:val="left"/>
+      <w:pPr>
+        <w:tabs>
+          <w:tab w:val="num" w:pos="5040"/>
+        </w:tabs>
+        <w:ind w:left="5040" w:hanging="360"/>
+      </w:pPr>
+      <w:rPr>
+        <w:rFonts w:ascii="Wingdings" w:hAnsi="Wingdings" w:hint="default"/>
+        <w:sz w:val="20"/>
+      </w:rPr>
+    </w:lvl>
+    <w:lvl w:ilvl="7" w:tentative="1">
+      <w:start w:val="1"/>
+      <w:numFmt w:val="bullet"/>
+      <w:lvlText w:val=""/>
+      <w:lvlJc w:val="left"/>
+      <w:pPr>
+        <w:tabs>
+          <w:tab w:val="num" w:pos="5760"/>
+        </w:tabs>
+        <w:ind w:left="5760" w:hanging="360"/>
+      </w:pPr>
+      <w:rPr>
+        <w:rFonts w:ascii="Wingdings" w:hAnsi="Wingdings" w:hint="default"/>
+        <w:sz w:val="20"/>
+      </w:rPr>
+    </w:lvl>
+    <w:lvl w:ilvl="8" w:tentative="1">
+      <w:start w:val="1"/>
+      <w:numFmt w:val="bullet"/>
+      <w:lvlText w:val=""/>
+      <w:lvlJc w:val="left"/>
+      <w:pPr>
+        <w:tabs>
+          <w:tab w:val="num" w:pos="6480"/>
+        </w:tabs>
+        <w:ind w:left="6480" w:hanging="360"/>
+      </w:pPr>
+      <w:rPr>
+        <w:rFonts w:ascii="Wingdings" w:hAnsi="Wingdings" w:hint="default"/>
+        <w:sz w:val="20"/>
+      </w:rPr>
+    </w:lvl>
+  </w:abstractNum>
+  <w:abstractNum w:abstractNumId="20" w15:restartNumberingAfterBreak="0">
+    <w:nsid w:val="79003A2F"/>
+    <w:multiLevelType w:val="multilevel"/>
+    <w:tmpl w:val="B48AA778"/>
+    <w:lvl w:ilvl="0">
+      <w:start w:val="1"/>
+      <w:numFmt w:val="bullet"/>
+      <w:lvlText w:val=""/>
+      <w:lvlJc w:val="left"/>
+      <w:pPr>
+        <w:tabs>
+          <w:tab w:val="num" w:pos="720"/>
+        </w:tabs>
+        <w:ind w:left="720" w:hanging="360"/>
+      </w:pPr>
+      <w:rPr>
+        <w:rFonts w:ascii="Symbol" w:hAnsi="Symbol" w:hint="default"/>
+        <w:sz w:val="20"/>
+      </w:rPr>
+    </w:lvl>
+    <w:lvl w:ilvl="1" w:tentative="1">
+      <w:start w:val="1"/>
+      <w:numFmt w:val="bullet"/>
+      <w:lvlText w:val="o"/>
+      <w:lvlJc w:val="left"/>
+      <w:pPr>
+        <w:tabs>
+          <w:tab w:val="num" w:pos="1440"/>
+        </w:tabs>
+        <w:ind w:left="1440" w:hanging="360"/>
+      </w:pPr>
+      <w:rPr>
+        <w:rFonts w:ascii="Courier New" w:hAnsi="Courier New" w:hint="default"/>
+        <w:sz w:val="20"/>
+      </w:rPr>
+    </w:lvl>
+    <w:lvl w:ilvl="2" w:tentative="1">
+      <w:start w:val="1"/>
+      <w:numFmt w:val="bullet"/>
+      <w:lvlText w:val=""/>
+      <w:lvlJc w:val="left"/>
+      <w:pPr>
+        <w:tabs>
+          <w:tab w:val="num" w:pos="2160"/>
+        </w:tabs>
+        <w:ind w:left="2160" w:hanging="360"/>
+      </w:pPr>
+      <w:rPr>
+        <w:rFonts w:ascii="Wingdings" w:hAnsi="Wingdings" w:hint="default"/>
+        <w:sz w:val="20"/>
+      </w:rPr>
+    </w:lvl>
+    <w:lvl w:ilvl="3" w:tentative="1">
+      <w:start w:val="1"/>
+      <w:numFmt w:val="bullet"/>
+      <w:lvlText w:val=""/>
+      <w:lvlJc w:val="left"/>
+      <w:pPr>
+        <w:tabs>
+          <w:tab w:val="num" w:pos="2880"/>
+        </w:tabs>
+        <w:ind w:left="2880" w:hanging="360"/>
+      </w:pPr>
+      <w:rPr>
+        <w:rFonts w:ascii="Wingdings" w:hAnsi="Wingdings" w:hint="default"/>
+        <w:sz w:val="20"/>
+      </w:rPr>
+    </w:lvl>
+    <w:lvl w:ilvl="4" w:tentative="1">
+      <w:start w:val="1"/>
+      <w:numFmt w:val="bullet"/>
+      <w:lvlText w:val=""/>
+      <w:lvlJc w:val="left"/>
+      <w:pPr>
+        <w:tabs>
+          <w:tab w:val="num" w:pos="3600"/>
+        </w:tabs>
+        <w:ind w:left="3600" w:hanging="360"/>
+      </w:pPr>
+      <w:rPr>
+        <w:rFonts w:ascii="Wingdings" w:hAnsi="Wingdings" w:hint="default"/>
+        <w:sz w:val="20"/>
+      </w:rPr>
+    </w:lvl>
+    <w:lvl w:ilvl="5" w:tentative="1">
+      <w:start w:val="1"/>
+      <w:numFmt w:val="bullet"/>
+      <w:lvlText w:val=""/>
+      <w:lvlJc w:val="left"/>
+      <w:pPr>
+        <w:tabs>
+          <w:tab w:val="num" w:pos="4320"/>
+        </w:tabs>
+        <w:ind w:left="4320" w:hanging="360"/>
+      </w:pPr>
+      <w:rPr>
+        <w:rFonts w:ascii="Wingdings" w:hAnsi="Wingdings" w:hint="default"/>
+        <w:sz w:val="20"/>
+      </w:rPr>
+    </w:lvl>
+    <w:lvl w:ilvl="6" w:tentative="1">
+      <w:start w:val="1"/>
+      <w:numFmt w:val="bullet"/>
+      <w:lvlText w:val=""/>
+      <w:lvlJc w:val="left"/>
+      <w:pPr>
+        <w:tabs>
+          <w:tab w:val="num" w:pos="5040"/>
+        </w:tabs>
+        <w:ind w:left="5040" w:hanging="360"/>
+      </w:pPr>
+      <w:rPr>
+        <w:rFonts w:ascii="Wingdings" w:hAnsi="Wingdings" w:hint="default"/>
+        <w:sz w:val="20"/>
+      </w:rPr>
+    </w:lvl>
+    <w:lvl w:ilvl="7" w:tentative="1">
+      <w:start w:val="1"/>
+      <w:numFmt w:val="bullet"/>
+      <w:lvlText w:val=""/>
+      <w:lvlJc w:val="left"/>
+      <w:pPr>
+        <w:tabs>
+          <w:tab w:val="num" w:pos="5760"/>
+        </w:tabs>
+        <w:ind w:left="5760" w:hanging="360"/>
+      </w:pPr>
+      <w:rPr>
+        <w:rFonts w:ascii="Wingdings" w:hAnsi="Wingdings" w:hint="default"/>
+        <w:sz w:val="20"/>
+      </w:rPr>
+    </w:lvl>
+    <w:lvl w:ilvl="8" w:tentative="1">
+      <w:start w:val="1"/>
+      <w:numFmt w:val="bullet"/>
+      <w:lvlText w:val=""/>
+      <w:lvlJc w:val="left"/>
+      <w:pPr>
+        <w:tabs>
+          <w:tab w:val="num" w:pos="6480"/>
+        </w:tabs>
+        <w:ind w:left="6480" w:hanging="360"/>
+      </w:pPr>
+      <w:rPr>
+        <w:rFonts w:ascii="Wingdings" w:hAnsi="Wingdings" w:hint="default"/>
+        <w:sz w:val="20"/>
+      </w:rPr>
+    </w:lvl>
+  </w:abstractNum>
   <w:num w:numId="1" w16cid:durableId="1771857334">
+    <w:abstractNumId w:val="13"/>
+  </w:num>
+  <w:num w:numId="2" w16cid:durableId="205220373">
+    <w:abstractNumId w:val="8"/>
+  </w:num>
+  <w:num w:numId="3" w16cid:durableId="687416552">
+    <w:abstractNumId w:val="12"/>
+  </w:num>
+  <w:num w:numId="4" w16cid:durableId="653417781">
+    <w:abstractNumId w:val="5"/>
+  </w:num>
+  <w:num w:numId="5" w16cid:durableId="588124414">
+    <w:abstractNumId w:val="4"/>
+  </w:num>
+  <w:num w:numId="6" w16cid:durableId="475992184">
+    <w:abstractNumId w:val="1"/>
+  </w:num>
+  <w:num w:numId="7" w16cid:durableId="215775200">
+    <w:abstractNumId w:val="20"/>
+  </w:num>
+  <w:num w:numId="8" w16cid:durableId="1203245822">
+    <w:abstractNumId w:val="6"/>
+  </w:num>
+  <w:num w:numId="9" w16cid:durableId="1183858471">
+    <w:abstractNumId w:val="9"/>
+  </w:num>
+  <w:num w:numId="10" w16cid:durableId="1822575676">
+    <w:abstractNumId w:val="2"/>
+  </w:num>
+  <w:num w:numId="11" w16cid:durableId="87430989">
+    <w:abstractNumId w:val="14"/>
+  </w:num>
+  <w:num w:numId="12" w16cid:durableId="1000082090">
+    <w:abstractNumId w:val="7"/>
+  </w:num>
+  <w:num w:numId="13" w16cid:durableId="645813940">
+    <w:abstractNumId w:val="16"/>
+  </w:num>
+  <w:num w:numId="14" w16cid:durableId="293220954">
+    <w:abstractNumId w:val="3"/>
+  </w:num>
+  <w:num w:numId="15" w16cid:durableId="1116828972">
+    <w:abstractNumId w:val="19"/>
+  </w:num>
+  <w:num w:numId="16" w16cid:durableId="531647586">
+    <w:abstractNumId w:val="17"/>
+  </w:num>
+  <w:num w:numId="17" w16cid:durableId="1298998446">
     <w:abstractNumId w:val="0"/>
+  </w:num>
+  <w:num w:numId="18" w16cid:durableId="345063752">
+    <w:abstractNumId w:val="18"/>
+  </w:num>
+  <w:num w:numId="19" w16cid:durableId="44060835">
+    <w:abstractNumId w:val="11"/>
+  </w:num>
+  <w:num w:numId="20" w16cid:durableId="2076976628">
+    <w:abstractNumId w:val="10"/>
+  </w:num>
+  <w:num w:numId="21" w16cid:durableId="1511289192">
+    <w:abstractNumId w:val="15"/>
   </w:num>
 </w:numbering>
 </file>

</xml_diff>